<commit_message>
documents: generate missing tables of contents
Some published scenario documents were missing a generated table of contents;
regenerate the TOC and re-save the docx + PDF.

Co-Authored-By: Claude Opus 4.8 (1M context) <noreply@anthropic.com>
</commit_message>
<xml_diff>
--- a/public/documents/YAT-LMS-Baseline-Solution-Design.docx
+++ b/public/documents/YAT-LMS-Baseline-Solution-Design.docx
@@ -1,6 +1,6 @@
 
 <file path=word/document.xml><?xml version="1.0" encoding="utf-8"?>
-<w:document xmlns:wpc="http://schemas.microsoft.com/office/word/2010/wordprocessingCanvas" xmlns:cx="http://schemas.microsoft.com/office/drawing/2014/chartex" xmlns:cx1="http://schemas.microsoft.com/office/drawing/2015/9/8/chartex" xmlns:cx2="http://schemas.microsoft.com/office/drawing/2015/10/21/chartex" xmlns:cx3="http://schemas.microsoft.com/office/drawing/2016/5/9/chartex" xmlns:cx4="http://schemas.microsoft.com/office/drawing/2016/5/10/chartex" xmlns:cx5="http://schemas.microsoft.com/office/drawing/2016/5/11/chartex" xmlns:cx6="http://schemas.microsoft.com/office/drawing/2016/5/12/chartex" xmlns:cx7="http://schemas.microsoft.com/office/drawing/2016/5/13/chartex" xmlns:cx8="http://schemas.microsoft.com/office/drawing/2016/5/14/chartex" xmlns:mc="http://schemas.openxmlformats.org/markup-compatibility/2006" xmlns:aink="http://schemas.microsoft.com/office/drawing/2016/ink" xmlns:am3d="http://schemas.microsoft.com/office/drawing/2017/model3d" xmlns:o="urn:schemas-microsoft-com:office:office" xmlns:oel="http://schemas.microsoft.com/office/2019/extlst" xmlns:r="http://schemas.openxmlformats.org/officeDocument/2006/relationships" xmlns:m="http://schemas.openxmlformats.org/officeDocument/2006/math" xmlns:v="urn:schemas-microsoft-com:vml" xmlns:wp14="http://schemas.microsoft.com/office/word/2010/wordprocessingDrawing" xmlns:wp="http://schemas.openxmlformats.org/drawingml/2006/wordprocessingDrawing" xmlns:w10="urn:schemas-microsoft-com:office:word" xmlns:w="http://schemas.openxmlformats.org/wordprocessingml/2006/main" xmlns:w14="http://schemas.microsoft.com/office/word/2010/wordml" xmlns:w15="http://schemas.microsoft.com/office/word/2012/wordml" xmlns:w16cex="http://schemas.microsoft.com/office/word/2018/wordml/cex" xmlns:w16cid="http://schemas.microsoft.com/office/word/2016/wordml/cid" xmlns:w16="http://schemas.microsoft.com/office/word/2018/wordml" xmlns:w16du="http://schemas.microsoft.com/office/word/2023/wordml/word16du" xmlns:w16sdtdh="http://schemas.microsoft.com/office/word/2020/wordml/sdtdatahash" xmlns:w16sdtfl="http://schemas.microsoft.com/office/word/2024/wordml/sdtformatlock" xmlns:w16se="http://schemas.microsoft.com/office/word/2015/wordml/symex" xmlns:wpg="http://schemas.microsoft.com/office/word/2010/wordprocessingGroup" xmlns:wpi="http://schemas.microsoft.com/office/word/2010/wordprocessingInk" xmlns:wne="http://schemas.microsoft.com/office/word/2006/wordml" xmlns:wps="http://schemas.microsoft.com/office/word/2010/wordprocessingShape" mc:Ignorable="w14 w15 w16se w16cid w16 w16cex w16sdtdh w16sdtfl w16du wp14">
+<w:document xmlns:wpc="http://schemas.microsoft.com/office/word/2010/wordprocessingCanvas" xmlns:cx="http://schemas.microsoft.com/office/drawing/2014/chartex" xmlns:cx1="http://schemas.microsoft.com/office/drawing/2015/9/8/chartex" xmlns:cx2="http://schemas.microsoft.com/office/drawing/2015/10/21/chartex" xmlns:cx3="http://schemas.microsoft.com/office/drawing/2016/5/9/chartex" xmlns:cx4="http://schemas.microsoft.com/office/drawing/2016/5/10/chartex" xmlns:cx5="http://schemas.microsoft.com/office/drawing/2016/5/11/chartex" xmlns:cx6="http://schemas.microsoft.com/office/drawing/2016/5/12/chartex" xmlns:cx7="http://schemas.microsoft.com/office/drawing/2016/5/13/chartex" xmlns:cx8="http://schemas.microsoft.com/office/drawing/2016/5/14/chartex" xmlns:mc="http://schemas.openxmlformats.org/markup-compatibility/2006" xmlns:m="http://schemas.openxmlformats.org/officeDocument/2006/math" xmlns:aink="http://schemas.microsoft.com/office/drawing/2016/ink" xmlns:am3d="http://schemas.microsoft.com/office/drawing/2017/model3d" xmlns:oel="http://schemas.microsoft.com/office/2019/extlst" xmlns:r="http://schemas.openxmlformats.org/officeDocument/2006/relationships" xmlns:wp14="http://schemas.microsoft.com/office/word/2010/wordprocessingDrawing" xmlns:wp="http://schemas.openxmlformats.org/drawingml/2006/wordprocessingDrawing" xmlns:wpg="http://schemas.microsoft.com/office/word/2010/wordprocessingGroup" xmlns:wpi="http://schemas.microsoft.com/office/word/2010/wordprocessingInk" xmlns:wps="http://schemas.microsoft.com/office/word/2010/wordprocessingShape" xmlns:o="urn:schemas-microsoft-com:office:office" xmlns:v="urn:schemas-microsoft-com:vml" xmlns:w10="urn:schemas-microsoft-com:office:word" xmlns:w="http://schemas.openxmlformats.org/wordprocessingml/2006/main" xmlns:w14="http://schemas.microsoft.com/office/word/2010/wordml" xmlns:w15="http://schemas.microsoft.com/office/word/2012/wordml" xmlns:w16cei="http://schemas.microsoft.com/office/word/2026/wordml/cei" xmlns:w16cex="http://schemas.microsoft.com/office/word/2018/wordml/cex" xmlns:w16cid="http://schemas.microsoft.com/office/word/2016/wordml/cid" xmlns:w16="http://schemas.microsoft.com/office/word/2018/wordml" xmlns:w16sdtdh="http://schemas.microsoft.com/office/word/2020/wordml/sdtdatahash" xmlns:w16sdtfl="http://schemas.microsoft.com/office/word/2024/wordml/sdtformatlock" xmlns:w16se="http://schemas.microsoft.com/office/word/2015/wordml/symex" xmlns:w16du="http://schemas.microsoft.com/office/word/2023/wordml/word16du" xmlns:wne="http://schemas.microsoft.com/office/word/2006/wordml" mc:Ignorable="w14 w15 w16se w16cid w16 w16cex w16sdtdh w16sdtfl w16du wp14">
   <w:body>
     <w:p>
       <w:r>
@@ -378,12 +378,23 @@
       <w:pPr>
         <w:pStyle w:val="Heading1"/>
       </w:pPr>
+      <w:bookmarkStart w:id="0" w:name="_Toc235021331"/>
       <w:r>
         <w:lastRenderedPageBreak/>
         <w:t>Contents</w:t>
       </w:r>
+      <w:bookmarkEnd w:id="0"/>
     </w:p>
     <w:p>
+      <w:pPr>
+        <w:pStyle w:val="TOC1"/>
+        <w:tabs>
+          <w:tab w:val="right" w:leader="dot" w:pos="9402"/>
+        </w:tabs>
+        <w:rPr>
+          <w:noProof/>
+        </w:rPr>
+      </w:pPr>
       <w:r>
         <w:fldChar w:fldCharType="begin"/>
       </w:r>
@@ -393,12 +404,2105 @@
       <w:r>
         <w:fldChar w:fldCharType="separate"/>
       </w:r>
-      <w:r>
+      <w:hyperlink w:anchor="_Toc235021331" w:history="1">
+        <w:r>
+          <w:rPr>
+            <w:rStyle w:val="Hyperlink"/>
+            <w:noProof/>
+          </w:rPr>
+          <w:t>Contents</w:t>
+        </w:r>
+        <w:r>
+          <w:rPr>
+            <w:noProof/>
+            <w:webHidden/>
+          </w:rPr>
+          <w:tab/>
+        </w:r>
+        <w:r>
+          <w:rPr>
+            <w:noProof/>
+            <w:webHidden/>
+          </w:rPr>
+          <w:fldChar w:fldCharType="begin"/>
+        </w:r>
+        <w:r>
+          <w:rPr>
+            <w:noProof/>
+            <w:webHidden/>
+          </w:rPr>
+          <w:instrText xml:space="preserve"> PAGEREF _Toc235021331 \h </w:instrText>
+        </w:r>
+        <w:r>
+          <w:rPr>
+            <w:noProof/>
+            <w:webHidden/>
+          </w:rPr>
+        </w:r>
+        <w:r>
+          <w:rPr>
+            <w:noProof/>
+            <w:webHidden/>
+          </w:rPr>
+          <w:fldChar w:fldCharType="separate"/>
+        </w:r>
+        <w:r>
+          <w:rPr>
+            <w:noProof/>
+            <w:webHidden/>
+          </w:rPr>
+          <w:t>2</w:t>
+        </w:r>
+        <w:r>
+          <w:rPr>
+            <w:noProof/>
+            <w:webHidden/>
+          </w:rPr>
+          <w:fldChar w:fldCharType="end"/>
+        </w:r>
+      </w:hyperlink>
+    </w:p>
+    <w:p>
+      <w:pPr>
+        <w:pStyle w:val="TOC1"/>
+        <w:tabs>
+          <w:tab w:val="right" w:leader="dot" w:pos="9402"/>
+        </w:tabs>
         <w:rPr>
-          <w:color w:val="6B6660"/>
+          <w:noProof/>
         </w:rPr>
-        <w:t>Right-click and choose “Update Field” to build the table of contents.</w:t>
-      </w:r>
+      </w:pPr>
+      <w:hyperlink w:anchor="_Toc235021332" w:history="1">
+        <w:r>
+          <w:rPr>
+            <w:rStyle w:val="Hyperlink"/>
+            <w:noProof/>
+          </w:rPr>
+          <w:t>1. Purpose and Scope</w:t>
+        </w:r>
+        <w:r>
+          <w:rPr>
+            <w:noProof/>
+            <w:webHidden/>
+          </w:rPr>
+          <w:tab/>
+        </w:r>
+        <w:r>
+          <w:rPr>
+            <w:noProof/>
+            <w:webHidden/>
+          </w:rPr>
+          <w:fldChar w:fldCharType="begin"/>
+        </w:r>
+        <w:r>
+          <w:rPr>
+            <w:noProof/>
+            <w:webHidden/>
+          </w:rPr>
+          <w:instrText xml:space="preserve"> PAGEREF _Toc235021332 \h </w:instrText>
+        </w:r>
+        <w:r>
+          <w:rPr>
+            <w:noProof/>
+            <w:webHidden/>
+          </w:rPr>
+        </w:r>
+        <w:r>
+          <w:rPr>
+            <w:noProof/>
+            <w:webHidden/>
+          </w:rPr>
+          <w:fldChar w:fldCharType="separate"/>
+        </w:r>
+        <w:r>
+          <w:rPr>
+            <w:noProof/>
+            <w:webHidden/>
+          </w:rPr>
+          <w:t>3</w:t>
+        </w:r>
+        <w:r>
+          <w:rPr>
+            <w:noProof/>
+            <w:webHidden/>
+          </w:rPr>
+          <w:fldChar w:fldCharType="end"/>
+        </w:r>
+      </w:hyperlink>
+    </w:p>
+    <w:p>
+      <w:pPr>
+        <w:pStyle w:val="TOC3"/>
+        <w:tabs>
+          <w:tab w:val="right" w:leader="dot" w:pos="9402"/>
+        </w:tabs>
+        <w:rPr>
+          <w:noProof/>
+        </w:rPr>
+      </w:pPr>
+      <w:hyperlink w:anchor="_Toc235021333" w:history="1">
+        <w:r>
+          <w:rPr>
+            <w:rStyle w:val="Hyperlink"/>
+            <w:noProof/>
+          </w:rPr>
+          <w:t>In scope of this design</w:t>
+        </w:r>
+        <w:r>
+          <w:rPr>
+            <w:noProof/>
+            <w:webHidden/>
+          </w:rPr>
+          <w:tab/>
+        </w:r>
+        <w:r>
+          <w:rPr>
+            <w:noProof/>
+            <w:webHidden/>
+          </w:rPr>
+          <w:fldChar w:fldCharType="begin"/>
+        </w:r>
+        <w:r>
+          <w:rPr>
+            <w:noProof/>
+            <w:webHidden/>
+          </w:rPr>
+          <w:instrText xml:space="preserve"> PAGEREF _Toc235021333 \h </w:instrText>
+        </w:r>
+        <w:r>
+          <w:rPr>
+            <w:noProof/>
+            <w:webHidden/>
+          </w:rPr>
+        </w:r>
+        <w:r>
+          <w:rPr>
+            <w:noProof/>
+            <w:webHidden/>
+          </w:rPr>
+          <w:fldChar w:fldCharType="separate"/>
+        </w:r>
+        <w:r>
+          <w:rPr>
+            <w:noProof/>
+            <w:webHidden/>
+          </w:rPr>
+          <w:t>3</w:t>
+        </w:r>
+        <w:r>
+          <w:rPr>
+            <w:noProof/>
+            <w:webHidden/>
+          </w:rPr>
+          <w:fldChar w:fldCharType="end"/>
+        </w:r>
+      </w:hyperlink>
+    </w:p>
+    <w:p>
+      <w:pPr>
+        <w:pStyle w:val="TOC3"/>
+        <w:tabs>
+          <w:tab w:val="right" w:leader="dot" w:pos="9402"/>
+        </w:tabs>
+        <w:rPr>
+          <w:noProof/>
+        </w:rPr>
+      </w:pPr>
+      <w:hyperlink w:anchor="_Toc235021334" w:history="1">
+        <w:r>
+          <w:rPr>
+            <w:rStyle w:val="Hyperlink"/>
+            <w:noProof/>
+          </w:rPr>
+          <w:t>Out of scope — deferred to the follow-on HA design phase</w:t>
+        </w:r>
+        <w:r>
+          <w:rPr>
+            <w:noProof/>
+            <w:webHidden/>
+          </w:rPr>
+          <w:tab/>
+        </w:r>
+        <w:r>
+          <w:rPr>
+            <w:noProof/>
+            <w:webHidden/>
+          </w:rPr>
+          <w:fldChar w:fldCharType="begin"/>
+        </w:r>
+        <w:r>
+          <w:rPr>
+            <w:noProof/>
+            <w:webHidden/>
+          </w:rPr>
+          <w:instrText xml:space="preserve"> PAGEREF _Toc235021334 \h </w:instrText>
+        </w:r>
+        <w:r>
+          <w:rPr>
+            <w:noProof/>
+            <w:webHidden/>
+          </w:rPr>
+        </w:r>
+        <w:r>
+          <w:rPr>
+            <w:noProof/>
+            <w:webHidden/>
+          </w:rPr>
+          <w:fldChar w:fldCharType="separate"/>
+        </w:r>
+        <w:r>
+          <w:rPr>
+            <w:noProof/>
+            <w:webHidden/>
+          </w:rPr>
+          <w:t>3</w:t>
+        </w:r>
+        <w:r>
+          <w:rPr>
+            <w:noProof/>
+            <w:webHidden/>
+          </w:rPr>
+          <w:fldChar w:fldCharType="end"/>
+        </w:r>
+      </w:hyperlink>
+    </w:p>
+    <w:p>
+      <w:pPr>
+        <w:pStyle w:val="TOC3"/>
+        <w:tabs>
+          <w:tab w:val="right" w:leader="dot" w:pos="9402"/>
+        </w:tabs>
+        <w:rPr>
+          <w:noProof/>
+        </w:rPr>
+      </w:pPr>
+      <w:hyperlink w:anchor="_Toc235021335" w:history="1">
+        <w:r>
+          <w:rPr>
+            <w:rStyle w:val="Hyperlink"/>
+            <w:noProof/>
+          </w:rPr>
+          <w:t>Out of MTS scope entirely — YAT ICT responsibility</w:t>
+        </w:r>
+        <w:r>
+          <w:rPr>
+            <w:noProof/>
+            <w:webHidden/>
+          </w:rPr>
+          <w:tab/>
+        </w:r>
+        <w:r>
+          <w:rPr>
+            <w:noProof/>
+            <w:webHidden/>
+          </w:rPr>
+          <w:fldChar w:fldCharType="begin"/>
+        </w:r>
+        <w:r>
+          <w:rPr>
+            <w:noProof/>
+            <w:webHidden/>
+          </w:rPr>
+          <w:instrText xml:space="preserve"> PAGEREF _Toc235021335 \h </w:instrText>
+        </w:r>
+        <w:r>
+          <w:rPr>
+            <w:noProof/>
+            <w:webHidden/>
+          </w:rPr>
+        </w:r>
+        <w:r>
+          <w:rPr>
+            <w:noProof/>
+            <w:webHidden/>
+          </w:rPr>
+          <w:fldChar w:fldCharType="separate"/>
+        </w:r>
+        <w:r>
+          <w:rPr>
+            <w:noProof/>
+            <w:webHidden/>
+          </w:rPr>
+          <w:t>3</w:t>
+        </w:r>
+        <w:r>
+          <w:rPr>
+            <w:noProof/>
+            <w:webHidden/>
+          </w:rPr>
+          <w:fldChar w:fldCharType="end"/>
+        </w:r>
+      </w:hyperlink>
+    </w:p>
+    <w:p>
+      <w:pPr>
+        <w:pStyle w:val="TOC1"/>
+        <w:tabs>
+          <w:tab w:val="right" w:leader="dot" w:pos="9402"/>
+        </w:tabs>
+        <w:rPr>
+          <w:noProof/>
+        </w:rPr>
+      </w:pPr>
+      <w:hyperlink w:anchor="_Toc235021336" w:history="1">
+        <w:r>
+          <w:rPr>
+            <w:rStyle w:val="Hyperlink"/>
+            <w:noProof/>
+          </w:rPr>
+          <w:t>2. Design Inputs and Requirements</w:t>
+        </w:r>
+        <w:r>
+          <w:rPr>
+            <w:noProof/>
+            <w:webHidden/>
+          </w:rPr>
+          <w:tab/>
+        </w:r>
+        <w:r>
+          <w:rPr>
+            <w:noProof/>
+            <w:webHidden/>
+          </w:rPr>
+          <w:fldChar w:fldCharType="begin"/>
+        </w:r>
+        <w:r>
+          <w:rPr>
+            <w:noProof/>
+            <w:webHidden/>
+          </w:rPr>
+          <w:instrText xml:space="preserve"> PAGEREF _Toc235021336 \h </w:instrText>
+        </w:r>
+        <w:r>
+          <w:rPr>
+            <w:noProof/>
+            <w:webHidden/>
+          </w:rPr>
+        </w:r>
+        <w:r>
+          <w:rPr>
+            <w:noProof/>
+            <w:webHidden/>
+          </w:rPr>
+          <w:fldChar w:fldCharType="separate"/>
+        </w:r>
+        <w:r>
+          <w:rPr>
+            <w:noProof/>
+            <w:webHidden/>
+          </w:rPr>
+          <w:t>3</w:t>
+        </w:r>
+        <w:r>
+          <w:rPr>
+            <w:noProof/>
+            <w:webHidden/>
+          </w:rPr>
+          <w:fldChar w:fldCharType="end"/>
+        </w:r>
+      </w:hyperlink>
+    </w:p>
+    <w:p>
+      <w:pPr>
+        <w:pStyle w:val="TOC3"/>
+        <w:tabs>
+          <w:tab w:val="right" w:leader="dot" w:pos="9402"/>
+        </w:tabs>
+        <w:rPr>
+          <w:noProof/>
+        </w:rPr>
+      </w:pPr>
+      <w:hyperlink w:anchor="_Toc235021337" w:history="1">
+        <w:r>
+          <w:rPr>
+            <w:rStyle w:val="Hyperlink"/>
+            <w:noProof/>
+          </w:rPr>
+          <w:t>2.1 Inputs</w:t>
+        </w:r>
+        <w:r>
+          <w:rPr>
+            <w:noProof/>
+            <w:webHidden/>
+          </w:rPr>
+          <w:tab/>
+        </w:r>
+        <w:r>
+          <w:rPr>
+            <w:noProof/>
+            <w:webHidden/>
+          </w:rPr>
+          <w:fldChar w:fldCharType="begin"/>
+        </w:r>
+        <w:r>
+          <w:rPr>
+            <w:noProof/>
+            <w:webHidden/>
+          </w:rPr>
+          <w:instrText xml:space="preserve"> PAGEREF _Toc235021337 \h </w:instrText>
+        </w:r>
+        <w:r>
+          <w:rPr>
+            <w:noProof/>
+            <w:webHidden/>
+          </w:rPr>
+        </w:r>
+        <w:r>
+          <w:rPr>
+            <w:noProof/>
+            <w:webHidden/>
+          </w:rPr>
+          <w:fldChar w:fldCharType="separate"/>
+        </w:r>
+        <w:r>
+          <w:rPr>
+            <w:noProof/>
+            <w:webHidden/>
+          </w:rPr>
+          <w:t>3</w:t>
+        </w:r>
+        <w:r>
+          <w:rPr>
+            <w:noProof/>
+            <w:webHidden/>
+          </w:rPr>
+          <w:fldChar w:fldCharType="end"/>
+        </w:r>
+      </w:hyperlink>
+    </w:p>
+    <w:p>
+      <w:pPr>
+        <w:pStyle w:val="TOC3"/>
+        <w:tabs>
+          <w:tab w:val="right" w:leader="dot" w:pos="9402"/>
+        </w:tabs>
+        <w:rPr>
+          <w:noProof/>
+        </w:rPr>
+      </w:pPr>
+      <w:hyperlink w:anchor="_Toc235021338" w:history="1">
+        <w:r>
+          <w:rPr>
+            <w:rStyle w:val="Hyperlink"/>
+            <w:noProof/>
+          </w:rPr>
+          <w:t>2.2 Requirements the design must meet</w:t>
+        </w:r>
+        <w:r>
+          <w:rPr>
+            <w:noProof/>
+            <w:webHidden/>
+          </w:rPr>
+          <w:tab/>
+        </w:r>
+        <w:r>
+          <w:rPr>
+            <w:noProof/>
+            <w:webHidden/>
+          </w:rPr>
+          <w:fldChar w:fldCharType="begin"/>
+        </w:r>
+        <w:r>
+          <w:rPr>
+            <w:noProof/>
+            <w:webHidden/>
+          </w:rPr>
+          <w:instrText xml:space="preserve"> PAGEREF _Toc235021338 \h </w:instrText>
+        </w:r>
+        <w:r>
+          <w:rPr>
+            <w:noProof/>
+            <w:webHidden/>
+          </w:rPr>
+        </w:r>
+        <w:r>
+          <w:rPr>
+            <w:noProof/>
+            <w:webHidden/>
+          </w:rPr>
+          <w:fldChar w:fldCharType="separate"/>
+        </w:r>
+        <w:r>
+          <w:rPr>
+            <w:noProof/>
+            <w:webHidden/>
+          </w:rPr>
+          <w:t>3</w:t>
+        </w:r>
+        <w:r>
+          <w:rPr>
+            <w:noProof/>
+            <w:webHidden/>
+          </w:rPr>
+          <w:fldChar w:fldCharType="end"/>
+        </w:r>
+      </w:hyperlink>
+    </w:p>
+    <w:p>
+      <w:pPr>
+        <w:pStyle w:val="TOC1"/>
+        <w:tabs>
+          <w:tab w:val="right" w:leader="dot" w:pos="9402"/>
+        </w:tabs>
+        <w:rPr>
+          <w:noProof/>
+        </w:rPr>
+      </w:pPr>
+      <w:hyperlink w:anchor="_Toc235021339" w:history="1">
+        <w:r>
+          <w:rPr>
+            <w:rStyle w:val="Hyperlink"/>
+            <w:noProof/>
+          </w:rPr>
+          <w:t>3. Review of Existing Architecture</w:t>
+        </w:r>
+        <w:r>
+          <w:rPr>
+            <w:noProof/>
+            <w:webHidden/>
+          </w:rPr>
+          <w:tab/>
+        </w:r>
+        <w:r>
+          <w:rPr>
+            <w:noProof/>
+            <w:webHidden/>
+          </w:rPr>
+          <w:fldChar w:fldCharType="begin"/>
+        </w:r>
+        <w:r>
+          <w:rPr>
+            <w:noProof/>
+            <w:webHidden/>
+          </w:rPr>
+          <w:instrText xml:space="preserve"> PAGEREF _Toc235021339 \h </w:instrText>
+        </w:r>
+        <w:r>
+          <w:rPr>
+            <w:noProof/>
+            <w:webHidden/>
+          </w:rPr>
+        </w:r>
+        <w:r>
+          <w:rPr>
+            <w:noProof/>
+            <w:webHidden/>
+          </w:rPr>
+          <w:fldChar w:fldCharType="separate"/>
+        </w:r>
+        <w:r>
+          <w:rPr>
+            <w:noProof/>
+            <w:webHidden/>
+          </w:rPr>
+          <w:t>4</w:t>
+        </w:r>
+        <w:r>
+          <w:rPr>
+            <w:noProof/>
+            <w:webHidden/>
+          </w:rPr>
+          <w:fldChar w:fldCharType="end"/>
+        </w:r>
+      </w:hyperlink>
+    </w:p>
+    <w:p>
+      <w:pPr>
+        <w:pStyle w:val="TOC1"/>
+        <w:tabs>
+          <w:tab w:val="right" w:leader="dot" w:pos="9402"/>
+        </w:tabs>
+        <w:rPr>
+          <w:noProof/>
+        </w:rPr>
+      </w:pPr>
+      <w:hyperlink w:anchor="_Toc235021340" w:history="1">
+        <w:r>
+          <w:rPr>
+            <w:rStyle w:val="Hyperlink"/>
+            <w:noProof/>
+          </w:rPr>
+          <w:t>4. Architecture Design</w:t>
+        </w:r>
+        <w:r>
+          <w:rPr>
+            <w:noProof/>
+            <w:webHidden/>
+          </w:rPr>
+          <w:tab/>
+        </w:r>
+        <w:r>
+          <w:rPr>
+            <w:noProof/>
+            <w:webHidden/>
+          </w:rPr>
+          <w:fldChar w:fldCharType="begin"/>
+        </w:r>
+        <w:r>
+          <w:rPr>
+            <w:noProof/>
+            <w:webHidden/>
+          </w:rPr>
+          <w:instrText xml:space="preserve"> PAGEREF _Toc235021340 \h </w:instrText>
+        </w:r>
+        <w:r>
+          <w:rPr>
+            <w:noProof/>
+            <w:webHidden/>
+          </w:rPr>
+        </w:r>
+        <w:r>
+          <w:rPr>
+            <w:noProof/>
+            <w:webHidden/>
+          </w:rPr>
+          <w:fldChar w:fldCharType="separate"/>
+        </w:r>
+        <w:r>
+          <w:rPr>
+            <w:noProof/>
+            <w:webHidden/>
+          </w:rPr>
+          <w:t>4</w:t>
+        </w:r>
+        <w:r>
+          <w:rPr>
+            <w:noProof/>
+            <w:webHidden/>
+          </w:rPr>
+          <w:fldChar w:fldCharType="end"/>
+        </w:r>
+      </w:hyperlink>
+    </w:p>
+    <w:p>
+      <w:pPr>
+        <w:pStyle w:val="TOC3"/>
+        <w:tabs>
+          <w:tab w:val="right" w:leader="dot" w:pos="9402"/>
+        </w:tabs>
+        <w:rPr>
+          <w:noProof/>
+        </w:rPr>
+      </w:pPr>
+      <w:hyperlink w:anchor="_Toc235021341" w:history="1">
+        <w:r>
+          <w:rPr>
+            <w:rStyle w:val="Hyperlink"/>
+            <w:noProof/>
+          </w:rPr>
+          <w:t>4.1 Assumptions and constraints</w:t>
+        </w:r>
+        <w:r>
+          <w:rPr>
+            <w:noProof/>
+            <w:webHidden/>
+          </w:rPr>
+          <w:tab/>
+        </w:r>
+        <w:r>
+          <w:rPr>
+            <w:noProof/>
+            <w:webHidden/>
+          </w:rPr>
+          <w:fldChar w:fldCharType="begin"/>
+        </w:r>
+        <w:r>
+          <w:rPr>
+            <w:noProof/>
+            <w:webHidden/>
+          </w:rPr>
+          <w:instrText xml:space="preserve"> PAGEREF _Toc235021341 \h </w:instrText>
+        </w:r>
+        <w:r>
+          <w:rPr>
+            <w:noProof/>
+            <w:webHidden/>
+          </w:rPr>
+        </w:r>
+        <w:r>
+          <w:rPr>
+            <w:noProof/>
+            <w:webHidden/>
+          </w:rPr>
+          <w:fldChar w:fldCharType="separate"/>
+        </w:r>
+        <w:r>
+          <w:rPr>
+            <w:noProof/>
+            <w:webHidden/>
+          </w:rPr>
+          <w:t>4</w:t>
+        </w:r>
+        <w:r>
+          <w:rPr>
+            <w:noProof/>
+            <w:webHidden/>
+          </w:rPr>
+          <w:fldChar w:fldCharType="end"/>
+        </w:r>
+      </w:hyperlink>
+    </w:p>
+    <w:p>
+      <w:pPr>
+        <w:pStyle w:val="TOC3"/>
+        <w:tabs>
+          <w:tab w:val="right" w:leader="dot" w:pos="9402"/>
+        </w:tabs>
+        <w:rPr>
+          <w:noProof/>
+        </w:rPr>
+      </w:pPr>
+      <w:hyperlink w:anchor="_Toc235021342" w:history="1">
+        <w:r>
+          <w:rPr>
+            <w:rStyle w:val="Hyperlink"/>
+            <w:noProof/>
+          </w:rPr>
+          <w:t>4.2 AWS account and region</w:t>
+        </w:r>
+        <w:r>
+          <w:rPr>
+            <w:noProof/>
+            <w:webHidden/>
+          </w:rPr>
+          <w:tab/>
+        </w:r>
+        <w:r>
+          <w:rPr>
+            <w:noProof/>
+            <w:webHidden/>
+          </w:rPr>
+          <w:fldChar w:fldCharType="begin"/>
+        </w:r>
+        <w:r>
+          <w:rPr>
+            <w:noProof/>
+            <w:webHidden/>
+          </w:rPr>
+          <w:instrText xml:space="preserve"> PAGEREF _Toc235021342 \h </w:instrText>
+        </w:r>
+        <w:r>
+          <w:rPr>
+            <w:noProof/>
+            <w:webHidden/>
+          </w:rPr>
+        </w:r>
+        <w:r>
+          <w:rPr>
+            <w:noProof/>
+            <w:webHidden/>
+          </w:rPr>
+          <w:fldChar w:fldCharType="separate"/>
+        </w:r>
+        <w:r>
+          <w:rPr>
+            <w:noProof/>
+            <w:webHidden/>
+          </w:rPr>
+          <w:t>4</w:t>
+        </w:r>
+        <w:r>
+          <w:rPr>
+            <w:noProof/>
+            <w:webHidden/>
+          </w:rPr>
+          <w:fldChar w:fldCharType="end"/>
+        </w:r>
+      </w:hyperlink>
+    </w:p>
+    <w:p>
+      <w:pPr>
+        <w:pStyle w:val="TOC3"/>
+        <w:tabs>
+          <w:tab w:val="right" w:leader="dot" w:pos="9402"/>
+        </w:tabs>
+        <w:rPr>
+          <w:noProof/>
+        </w:rPr>
+      </w:pPr>
+      <w:hyperlink w:anchor="_Toc235021343" w:history="1">
+        <w:r>
+          <w:rPr>
+            <w:rStyle w:val="Hyperlink"/>
+            <w:noProof/>
+          </w:rPr>
+          <w:t>4.3 Identity and Access Management (IAM)</w:t>
+        </w:r>
+        <w:r>
+          <w:rPr>
+            <w:noProof/>
+            <w:webHidden/>
+          </w:rPr>
+          <w:tab/>
+        </w:r>
+        <w:r>
+          <w:rPr>
+            <w:noProof/>
+            <w:webHidden/>
+          </w:rPr>
+          <w:fldChar w:fldCharType="begin"/>
+        </w:r>
+        <w:r>
+          <w:rPr>
+            <w:noProof/>
+            <w:webHidden/>
+          </w:rPr>
+          <w:instrText xml:space="preserve"> PAGEREF _Toc235021343 \h </w:instrText>
+        </w:r>
+        <w:r>
+          <w:rPr>
+            <w:noProof/>
+            <w:webHidden/>
+          </w:rPr>
+        </w:r>
+        <w:r>
+          <w:rPr>
+            <w:noProof/>
+            <w:webHidden/>
+          </w:rPr>
+          <w:fldChar w:fldCharType="separate"/>
+        </w:r>
+        <w:r>
+          <w:rPr>
+            <w:noProof/>
+            <w:webHidden/>
+          </w:rPr>
+          <w:t>4</w:t>
+        </w:r>
+        <w:r>
+          <w:rPr>
+            <w:noProof/>
+            <w:webHidden/>
+          </w:rPr>
+          <w:fldChar w:fldCharType="end"/>
+        </w:r>
+      </w:hyperlink>
+    </w:p>
+    <w:p>
+      <w:pPr>
+        <w:pStyle w:val="TOC3"/>
+        <w:tabs>
+          <w:tab w:val="right" w:leader="dot" w:pos="9402"/>
+        </w:tabs>
+        <w:rPr>
+          <w:noProof/>
+        </w:rPr>
+      </w:pPr>
+      <w:hyperlink w:anchor="_Toc235021344" w:history="1">
+        <w:r>
+          <w:rPr>
+            <w:rStyle w:val="Hyperlink"/>
+            <w:noProof/>
+          </w:rPr>
+          <w:t>4.4 Network topology</w:t>
+        </w:r>
+        <w:r>
+          <w:rPr>
+            <w:noProof/>
+            <w:webHidden/>
+          </w:rPr>
+          <w:tab/>
+        </w:r>
+        <w:r>
+          <w:rPr>
+            <w:noProof/>
+            <w:webHidden/>
+          </w:rPr>
+          <w:fldChar w:fldCharType="begin"/>
+        </w:r>
+        <w:r>
+          <w:rPr>
+            <w:noProof/>
+            <w:webHidden/>
+          </w:rPr>
+          <w:instrText xml:space="preserve"> PAGEREF _Toc235021344 \h </w:instrText>
+        </w:r>
+        <w:r>
+          <w:rPr>
+            <w:noProof/>
+            <w:webHidden/>
+          </w:rPr>
+        </w:r>
+        <w:r>
+          <w:rPr>
+            <w:noProof/>
+            <w:webHidden/>
+          </w:rPr>
+          <w:fldChar w:fldCharType="separate"/>
+        </w:r>
+        <w:r>
+          <w:rPr>
+            <w:noProof/>
+            <w:webHidden/>
+          </w:rPr>
+          <w:t>5</w:t>
+        </w:r>
+        <w:r>
+          <w:rPr>
+            <w:noProof/>
+            <w:webHidden/>
+          </w:rPr>
+          <w:fldChar w:fldCharType="end"/>
+        </w:r>
+      </w:hyperlink>
+    </w:p>
+    <w:p>
+      <w:pPr>
+        <w:pStyle w:val="TOC3"/>
+        <w:tabs>
+          <w:tab w:val="right" w:leader="dot" w:pos="9402"/>
+        </w:tabs>
+        <w:rPr>
+          <w:noProof/>
+        </w:rPr>
+      </w:pPr>
+      <w:hyperlink w:anchor="_Toc235021345" w:history="1">
+        <w:r>
+          <w:rPr>
+            <w:rStyle w:val="Hyperlink"/>
+            <w:noProof/>
+          </w:rPr>
+          <w:t>4.5 Compute (EC2 + Auto Scaling)</w:t>
+        </w:r>
+        <w:r>
+          <w:rPr>
+            <w:noProof/>
+            <w:webHidden/>
+          </w:rPr>
+          <w:tab/>
+        </w:r>
+        <w:r>
+          <w:rPr>
+            <w:noProof/>
+            <w:webHidden/>
+          </w:rPr>
+          <w:fldChar w:fldCharType="begin"/>
+        </w:r>
+        <w:r>
+          <w:rPr>
+            <w:noProof/>
+            <w:webHidden/>
+          </w:rPr>
+          <w:instrText xml:space="preserve"> PAGEREF _Toc235021345 \h </w:instrText>
+        </w:r>
+        <w:r>
+          <w:rPr>
+            <w:noProof/>
+            <w:webHidden/>
+          </w:rPr>
+        </w:r>
+        <w:r>
+          <w:rPr>
+            <w:noProof/>
+            <w:webHidden/>
+          </w:rPr>
+          <w:fldChar w:fldCharType="separate"/>
+        </w:r>
+        <w:r>
+          <w:rPr>
+            <w:noProof/>
+            <w:webHidden/>
+          </w:rPr>
+          <w:t>5</w:t>
+        </w:r>
+        <w:r>
+          <w:rPr>
+            <w:noProof/>
+            <w:webHidden/>
+          </w:rPr>
+          <w:fldChar w:fldCharType="end"/>
+        </w:r>
+      </w:hyperlink>
+    </w:p>
+    <w:p>
+      <w:pPr>
+        <w:pStyle w:val="TOC3"/>
+        <w:tabs>
+          <w:tab w:val="right" w:leader="dot" w:pos="9402"/>
+        </w:tabs>
+        <w:rPr>
+          <w:noProof/>
+        </w:rPr>
+      </w:pPr>
+      <w:hyperlink w:anchor="_Toc235021346" w:history="1">
+        <w:r>
+          <w:rPr>
+            <w:rStyle w:val="Hyperlink"/>
+            <w:noProof/>
+          </w:rPr>
+          <w:t>4.6 Load balancing (ALB)</w:t>
+        </w:r>
+        <w:r>
+          <w:rPr>
+            <w:noProof/>
+            <w:webHidden/>
+          </w:rPr>
+          <w:tab/>
+        </w:r>
+        <w:r>
+          <w:rPr>
+            <w:noProof/>
+            <w:webHidden/>
+          </w:rPr>
+          <w:fldChar w:fldCharType="begin"/>
+        </w:r>
+        <w:r>
+          <w:rPr>
+            <w:noProof/>
+            <w:webHidden/>
+          </w:rPr>
+          <w:instrText xml:space="preserve"> PAGEREF _Toc235021346 \h </w:instrText>
+        </w:r>
+        <w:r>
+          <w:rPr>
+            <w:noProof/>
+            <w:webHidden/>
+          </w:rPr>
+        </w:r>
+        <w:r>
+          <w:rPr>
+            <w:noProof/>
+            <w:webHidden/>
+          </w:rPr>
+          <w:fldChar w:fldCharType="separate"/>
+        </w:r>
+        <w:r>
+          <w:rPr>
+            <w:noProof/>
+            <w:webHidden/>
+          </w:rPr>
+          <w:t>6</w:t>
+        </w:r>
+        <w:r>
+          <w:rPr>
+            <w:noProof/>
+            <w:webHidden/>
+          </w:rPr>
+          <w:fldChar w:fldCharType="end"/>
+        </w:r>
+      </w:hyperlink>
+    </w:p>
+    <w:p>
+      <w:pPr>
+        <w:pStyle w:val="TOC3"/>
+        <w:tabs>
+          <w:tab w:val="right" w:leader="dot" w:pos="9402"/>
+        </w:tabs>
+        <w:rPr>
+          <w:noProof/>
+        </w:rPr>
+      </w:pPr>
+      <w:hyperlink w:anchor="_Toc235021347" w:history="1">
+        <w:r>
+          <w:rPr>
+            <w:rStyle w:val="Hyperlink"/>
+            <w:noProof/>
+          </w:rPr>
+          <w:t>4.7 Database (RDS)</w:t>
+        </w:r>
+        <w:r>
+          <w:rPr>
+            <w:noProof/>
+            <w:webHidden/>
+          </w:rPr>
+          <w:tab/>
+        </w:r>
+        <w:r>
+          <w:rPr>
+            <w:noProof/>
+            <w:webHidden/>
+          </w:rPr>
+          <w:fldChar w:fldCharType="begin"/>
+        </w:r>
+        <w:r>
+          <w:rPr>
+            <w:noProof/>
+            <w:webHidden/>
+          </w:rPr>
+          <w:instrText xml:space="preserve"> PAGEREF _Toc235021347 \h </w:instrText>
+        </w:r>
+        <w:r>
+          <w:rPr>
+            <w:noProof/>
+            <w:webHidden/>
+          </w:rPr>
+        </w:r>
+        <w:r>
+          <w:rPr>
+            <w:noProof/>
+            <w:webHidden/>
+          </w:rPr>
+          <w:fldChar w:fldCharType="separate"/>
+        </w:r>
+        <w:r>
+          <w:rPr>
+            <w:noProof/>
+            <w:webHidden/>
+          </w:rPr>
+          <w:t>6</w:t>
+        </w:r>
+        <w:r>
+          <w:rPr>
+            <w:noProof/>
+            <w:webHidden/>
+          </w:rPr>
+          <w:fldChar w:fldCharType="end"/>
+        </w:r>
+      </w:hyperlink>
+    </w:p>
+    <w:p>
+      <w:pPr>
+        <w:pStyle w:val="TOC3"/>
+        <w:tabs>
+          <w:tab w:val="right" w:leader="dot" w:pos="9402"/>
+        </w:tabs>
+        <w:rPr>
+          <w:noProof/>
+        </w:rPr>
+      </w:pPr>
+      <w:hyperlink w:anchor="_Toc235021348" w:history="1">
+        <w:r>
+          <w:rPr>
+            <w:rStyle w:val="Hyperlink"/>
+            <w:noProof/>
+          </w:rPr>
+          <w:t>4.8 Storage</w:t>
+        </w:r>
+        <w:r>
+          <w:rPr>
+            <w:noProof/>
+            <w:webHidden/>
+          </w:rPr>
+          <w:tab/>
+        </w:r>
+        <w:r>
+          <w:rPr>
+            <w:noProof/>
+            <w:webHidden/>
+          </w:rPr>
+          <w:fldChar w:fldCharType="begin"/>
+        </w:r>
+        <w:r>
+          <w:rPr>
+            <w:noProof/>
+            <w:webHidden/>
+          </w:rPr>
+          <w:instrText xml:space="preserve"> PAGEREF _Toc235021348 \h </w:instrText>
+        </w:r>
+        <w:r>
+          <w:rPr>
+            <w:noProof/>
+            <w:webHidden/>
+          </w:rPr>
+        </w:r>
+        <w:r>
+          <w:rPr>
+            <w:noProof/>
+            <w:webHidden/>
+          </w:rPr>
+          <w:fldChar w:fldCharType="separate"/>
+        </w:r>
+        <w:r>
+          <w:rPr>
+            <w:noProof/>
+            <w:webHidden/>
+          </w:rPr>
+          <w:t>6</w:t>
+        </w:r>
+        <w:r>
+          <w:rPr>
+            <w:noProof/>
+            <w:webHidden/>
+          </w:rPr>
+          <w:fldChar w:fldCharType="end"/>
+        </w:r>
+      </w:hyperlink>
+    </w:p>
+    <w:p>
+      <w:pPr>
+        <w:pStyle w:val="TOC3"/>
+        <w:tabs>
+          <w:tab w:val="right" w:leader="dot" w:pos="9402"/>
+        </w:tabs>
+        <w:rPr>
+          <w:noProof/>
+        </w:rPr>
+      </w:pPr>
+      <w:hyperlink w:anchor="_Toc235021349" w:history="1">
+        <w:r>
+          <w:rPr>
+            <w:rStyle w:val="Hyperlink"/>
+            <w:noProof/>
+          </w:rPr>
+          <w:t>4.9 Security</w:t>
+        </w:r>
+        <w:r>
+          <w:rPr>
+            <w:noProof/>
+            <w:webHidden/>
+          </w:rPr>
+          <w:tab/>
+        </w:r>
+        <w:r>
+          <w:rPr>
+            <w:noProof/>
+            <w:webHidden/>
+          </w:rPr>
+          <w:fldChar w:fldCharType="begin"/>
+        </w:r>
+        <w:r>
+          <w:rPr>
+            <w:noProof/>
+            <w:webHidden/>
+          </w:rPr>
+          <w:instrText xml:space="preserve"> PAGEREF _Toc235021349 \h </w:instrText>
+        </w:r>
+        <w:r>
+          <w:rPr>
+            <w:noProof/>
+            <w:webHidden/>
+          </w:rPr>
+        </w:r>
+        <w:r>
+          <w:rPr>
+            <w:noProof/>
+            <w:webHidden/>
+          </w:rPr>
+          <w:fldChar w:fldCharType="separate"/>
+        </w:r>
+        <w:r>
+          <w:rPr>
+            <w:noProof/>
+            <w:webHidden/>
+          </w:rPr>
+          <w:t>6</w:t>
+        </w:r>
+        <w:r>
+          <w:rPr>
+            <w:noProof/>
+            <w:webHidden/>
+          </w:rPr>
+          <w:fldChar w:fldCharType="end"/>
+        </w:r>
+      </w:hyperlink>
+    </w:p>
+    <w:p>
+      <w:pPr>
+        <w:pStyle w:val="TOC3"/>
+        <w:tabs>
+          <w:tab w:val="right" w:leader="dot" w:pos="9402"/>
+        </w:tabs>
+        <w:rPr>
+          <w:noProof/>
+        </w:rPr>
+      </w:pPr>
+      <w:hyperlink w:anchor="_Toc235021350" w:history="1">
+        <w:r>
+          <w:rPr>
+            <w:rStyle w:val="Hyperlink"/>
+            <w:noProof/>
+          </w:rPr>
+          <w:t>4.10 Monitoring (baseline)</w:t>
+        </w:r>
+        <w:r>
+          <w:rPr>
+            <w:noProof/>
+            <w:webHidden/>
+          </w:rPr>
+          <w:tab/>
+        </w:r>
+        <w:r>
+          <w:rPr>
+            <w:noProof/>
+            <w:webHidden/>
+          </w:rPr>
+          <w:fldChar w:fldCharType="begin"/>
+        </w:r>
+        <w:r>
+          <w:rPr>
+            <w:noProof/>
+            <w:webHidden/>
+          </w:rPr>
+          <w:instrText xml:space="preserve"> PAGEREF _Toc235021350 \h </w:instrText>
+        </w:r>
+        <w:r>
+          <w:rPr>
+            <w:noProof/>
+            <w:webHidden/>
+          </w:rPr>
+        </w:r>
+        <w:r>
+          <w:rPr>
+            <w:noProof/>
+            <w:webHidden/>
+          </w:rPr>
+          <w:fldChar w:fldCharType="separate"/>
+        </w:r>
+        <w:r>
+          <w:rPr>
+            <w:noProof/>
+            <w:webHidden/>
+          </w:rPr>
+          <w:t>6</w:t>
+        </w:r>
+        <w:r>
+          <w:rPr>
+            <w:noProof/>
+            <w:webHidden/>
+          </w:rPr>
+          <w:fldChar w:fldCharType="end"/>
+        </w:r>
+      </w:hyperlink>
+    </w:p>
+    <w:p>
+      <w:pPr>
+        <w:pStyle w:val="TOC3"/>
+        <w:tabs>
+          <w:tab w:val="right" w:leader="dot" w:pos="9402"/>
+        </w:tabs>
+        <w:rPr>
+          <w:noProof/>
+        </w:rPr>
+      </w:pPr>
+      <w:hyperlink w:anchor="_Toc235021351" w:history="1">
+        <w:r>
+          <w:rPr>
+            <w:rStyle w:val="Hyperlink"/>
+            <w:noProof/>
+          </w:rPr>
+          <w:t>4.11 Naming and tagging conventions</w:t>
+        </w:r>
+        <w:r>
+          <w:rPr>
+            <w:noProof/>
+            <w:webHidden/>
+          </w:rPr>
+          <w:tab/>
+        </w:r>
+        <w:r>
+          <w:rPr>
+            <w:noProof/>
+            <w:webHidden/>
+          </w:rPr>
+          <w:fldChar w:fldCharType="begin"/>
+        </w:r>
+        <w:r>
+          <w:rPr>
+            <w:noProof/>
+            <w:webHidden/>
+          </w:rPr>
+          <w:instrText xml:space="preserve"> PAGEREF _Toc235021351 \h </w:instrText>
+        </w:r>
+        <w:r>
+          <w:rPr>
+            <w:noProof/>
+            <w:webHidden/>
+          </w:rPr>
+        </w:r>
+        <w:r>
+          <w:rPr>
+            <w:noProof/>
+            <w:webHidden/>
+          </w:rPr>
+          <w:fldChar w:fldCharType="separate"/>
+        </w:r>
+        <w:r>
+          <w:rPr>
+            <w:noProof/>
+            <w:webHidden/>
+          </w:rPr>
+          <w:t>7</w:t>
+        </w:r>
+        <w:r>
+          <w:rPr>
+            <w:noProof/>
+            <w:webHidden/>
+          </w:rPr>
+          <w:fldChar w:fldCharType="end"/>
+        </w:r>
+      </w:hyperlink>
+    </w:p>
+    <w:p>
+      <w:pPr>
+        <w:pStyle w:val="TOC3"/>
+        <w:tabs>
+          <w:tab w:val="right" w:leader="dot" w:pos="9402"/>
+        </w:tabs>
+        <w:rPr>
+          <w:noProof/>
+        </w:rPr>
+      </w:pPr>
+      <w:hyperlink w:anchor="_Toc235021352" w:history="1">
+        <w:r>
+          <w:rPr>
+            <w:rStyle w:val="Hyperlink"/>
+            <w:noProof/>
+          </w:rPr>
+          <w:t>4.12 Backup</w:t>
+        </w:r>
+        <w:r>
+          <w:rPr>
+            <w:noProof/>
+            <w:webHidden/>
+          </w:rPr>
+          <w:tab/>
+        </w:r>
+        <w:r>
+          <w:rPr>
+            <w:noProof/>
+            <w:webHidden/>
+          </w:rPr>
+          <w:fldChar w:fldCharType="begin"/>
+        </w:r>
+        <w:r>
+          <w:rPr>
+            <w:noProof/>
+            <w:webHidden/>
+          </w:rPr>
+          <w:instrText xml:space="preserve"> PAGEREF _Toc235021352 \h </w:instrText>
+        </w:r>
+        <w:r>
+          <w:rPr>
+            <w:noProof/>
+            <w:webHidden/>
+          </w:rPr>
+        </w:r>
+        <w:r>
+          <w:rPr>
+            <w:noProof/>
+            <w:webHidden/>
+          </w:rPr>
+          <w:fldChar w:fldCharType="separate"/>
+        </w:r>
+        <w:r>
+          <w:rPr>
+            <w:noProof/>
+            <w:webHidden/>
+          </w:rPr>
+          <w:t>7</w:t>
+        </w:r>
+        <w:r>
+          <w:rPr>
+            <w:noProof/>
+            <w:webHidden/>
+          </w:rPr>
+          <w:fldChar w:fldCharType="end"/>
+        </w:r>
+      </w:hyperlink>
+    </w:p>
+    <w:p>
+      <w:pPr>
+        <w:pStyle w:val="TOC3"/>
+        <w:tabs>
+          <w:tab w:val="right" w:leader="dot" w:pos="9402"/>
+        </w:tabs>
+        <w:rPr>
+          <w:noProof/>
+        </w:rPr>
+      </w:pPr>
+      <w:hyperlink w:anchor="_Toc235021353" w:history="1">
+        <w:r>
+          <w:rPr>
+            <w:rStyle w:val="Hyperlink"/>
+            <w:noProof/>
+          </w:rPr>
+          <w:t>4.13 Recovery objectives — baseline state</w:t>
+        </w:r>
+        <w:r>
+          <w:rPr>
+            <w:noProof/>
+            <w:webHidden/>
+          </w:rPr>
+          <w:tab/>
+        </w:r>
+        <w:r>
+          <w:rPr>
+            <w:noProof/>
+            <w:webHidden/>
+          </w:rPr>
+          <w:fldChar w:fldCharType="begin"/>
+        </w:r>
+        <w:r>
+          <w:rPr>
+            <w:noProof/>
+            <w:webHidden/>
+          </w:rPr>
+          <w:instrText xml:space="preserve"> PAGEREF _Toc235021353 \h </w:instrText>
+        </w:r>
+        <w:r>
+          <w:rPr>
+            <w:noProof/>
+            <w:webHidden/>
+          </w:rPr>
+        </w:r>
+        <w:r>
+          <w:rPr>
+            <w:noProof/>
+            <w:webHidden/>
+          </w:rPr>
+          <w:fldChar w:fldCharType="separate"/>
+        </w:r>
+        <w:r>
+          <w:rPr>
+            <w:noProof/>
+            <w:webHidden/>
+          </w:rPr>
+          <w:t>7</w:t>
+        </w:r>
+        <w:r>
+          <w:rPr>
+            <w:noProof/>
+            <w:webHidden/>
+          </w:rPr>
+          <w:fldChar w:fldCharType="end"/>
+        </w:r>
+      </w:hyperlink>
+    </w:p>
+    <w:p>
+      <w:pPr>
+        <w:pStyle w:val="TOC3"/>
+        <w:tabs>
+          <w:tab w:val="right" w:leader="dot" w:pos="9402"/>
+        </w:tabs>
+        <w:rPr>
+          <w:noProof/>
+        </w:rPr>
+      </w:pPr>
+      <w:hyperlink w:anchor="_Toc235021354" w:history="1">
+        <w:r>
+          <w:rPr>
+            <w:rStyle w:val="Hyperlink"/>
+            <w:noProof/>
+          </w:rPr>
+          <w:t>4.14 Components requiring vertical scaling</w:t>
+        </w:r>
+        <w:r>
+          <w:rPr>
+            <w:noProof/>
+            <w:webHidden/>
+          </w:rPr>
+          <w:tab/>
+        </w:r>
+        <w:r>
+          <w:rPr>
+            <w:noProof/>
+            <w:webHidden/>
+          </w:rPr>
+          <w:fldChar w:fldCharType="begin"/>
+        </w:r>
+        <w:r>
+          <w:rPr>
+            <w:noProof/>
+            <w:webHidden/>
+          </w:rPr>
+          <w:instrText xml:space="preserve"> PAGEREF _Toc235021354 \h </w:instrText>
+        </w:r>
+        <w:r>
+          <w:rPr>
+            <w:noProof/>
+            <w:webHidden/>
+          </w:rPr>
+        </w:r>
+        <w:r>
+          <w:rPr>
+            <w:noProof/>
+            <w:webHidden/>
+          </w:rPr>
+          <w:fldChar w:fldCharType="separate"/>
+        </w:r>
+        <w:r>
+          <w:rPr>
+            <w:noProof/>
+            <w:webHidden/>
+          </w:rPr>
+          <w:t>7</w:t>
+        </w:r>
+        <w:r>
+          <w:rPr>
+            <w:noProof/>
+            <w:webHidden/>
+          </w:rPr>
+          <w:fldChar w:fldCharType="end"/>
+        </w:r>
+      </w:hyperlink>
+    </w:p>
+    <w:p>
+      <w:pPr>
+        <w:pStyle w:val="TOC3"/>
+        <w:tabs>
+          <w:tab w:val="right" w:leader="dot" w:pos="9402"/>
+        </w:tabs>
+        <w:rPr>
+          <w:noProof/>
+        </w:rPr>
+      </w:pPr>
+      <w:hyperlink w:anchor="_Toc235021355" w:history="1">
+        <w:r>
+          <w:rPr>
+            <w:rStyle w:val="Hyperlink"/>
+            <w:noProof/>
+          </w:rPr>
+          <w:t>4.15 Single points of failure removed</w:t>
+        </w:r>
+        <w:r>
+          <w:rPr>
+            <w:noProof/>
+            <w:webHidden/>
+          </w:rPr>
+          <w:tab/>
+        </w:r>
+        <w:r>
+          <w:rPr>
+            <w:noProof/>
+            <w:webHidden/>
+          </w:rPr>
+          <w:fldChar w:fldCharType="begin"/>
+        </w:r>
+        <w:r>
+          <w:rPr>
+            <w:noProof/>
+            <w:webHidden/>
+          </w:rPr>
+          <w:instrText xml:space="preserve"> PAGEREF _Toc235021355 \h </w:instrText>
+        </w:r>
+        <w:r>
+          <w:rPr>
+            <w:noProof/>
+            <w:webHidden/>
+          </w:rPr>
+        </w:r>
+        <w:r>
+          <w:rPr>
+            <w:noProof/>
+            <w:webHidden/>
+          </w:rPr>
+          <w:fldChar w:fldCharType="separate"/>
+        </w:r>
+        <w:r>
+          <w:rPr>
+            <w:noProof/>
+            <w:webHidden/>
+          </w:rPr>
+          <w:t>7</w:t>
+        </w:r>
+        <w:r>
+          <w:rPr>
+            <w:noProof/>
+            <w:webHidden/>
+          </w:rPr>
+          <w:fldChar w:fldCharType="end"/>
+        </w:r>
+      </w:hyperlink>
+    </w:p>
+    <w:p>
+      <w:pPr>
+        <w:pStyle w:val="TOC3"/>
+        <w:tabs>
+          <w:tab w:val="right" w:leader="dot" w:pos="9402"/>
+        </w:tabs>
+        <w:rPr>
+          <w:noProof/>
+        </w:rPr>
+      </w:pPr>
+      <w:hyperlink w:anchor="_Toc235021356" w:history="1">
+        <w:r>
+          <w:rPr>
+            <w:rStyle w:val="Hyperlink"/>
+            <w:noProof/>
+          </w:rPr>
+          <w:t>4.16 Configuration decisions left to the implementer</w:t>
+        </w:r>
+        <w:r>
+          <w:rPr>
+            <w:noProof/>
+            <w:webHidden/>
+          </w:rPr>
+          <w:tab/>
+        </w:r>
+        <w:r>
+          <w:rPr>
+            <w:noProof/>
+            <w:webHidden/>
+          </w:rPr>
+          <w:fldChar w:fldCharType="begin"/>
+        </w:r>
+        <w:r>
+          <w:rPr>
+            <w:noProof/>
+            <w:webHidden/>
+          </w:rPr>
+          <w:instrText xml:space="preserve"> PAGEREF _Toc235021356 \h </w:instrText>
+        </w:r>
+        <w:r>
+          <w:rPr>
+            <w:noProof/>
+            <w:webHidden/>
+          </w:rPr>
+        </w:r>
+        <w:r>
+          <w:rPr>
+            <w:noProof/>
+            <w:webHidden/>
+          </w:rPr>
+          <w:fldChar w:fldCharType="separate"/>
+        </w:r>
+        <w:r>
+          <w:rPr>
+            <w:noProof/>
+            <w:webHidden/>
+          </w:rPr>
+          <w:t>8</w:t>
+        </w:r>
+        <w:r>
+          <w:rPr>
+            <w:noProof/>
+            <w:webHidden/>
+          </w:rPr>
+          <w:fldChar w:fldCharType="end"/>
+        </w:r>
+      </w:hyperlink>
+    </w:p>
+    <w:p>
+      <w:pPr>
+        <w:pStyle w:val="TOC1"/>
+        <w:tabs>
+          <w:tab w:val="right" w:leader="dot" w:pos="9402"/>
+        </w:tabs>
+        <w:rPr>
+          <w:noProof/>
+        </w:rPr>
+      </w:pPr>
+      <w:hyperlink w:anchor="_Toc235021357" w:history="1">
+        <w:r>
+          <w:rPr>
+            <w:rStyle w:val="Hyperlink"/>
+            <w:noProof/>
+          </w:rPr>
+          <w:t>5. Implementation Sequencing</w:t>
+        </w:r>
+        <w:r>
+          <w:rPr>
+            <w:noProof/>
+            <w:webHidden/>
+          </w:rPr>
+          <w:tab/>
+        </w:r>
+        <w:r>
+          <w:rPr>
+            <w:noProof/>
+            <w:webHidden/>
+          </w:rPr>
+          <w:fldChar w:fldCharType="begin"/>
+        </w:r>
+        <w:r>
+          <w:rPr>
+            <w:noProof/>
+            <w:webHidden/>
+          </w:rPr>
+          <w:instrText xml:space="preserve"> PAGEREF _Toc235021357 \h </w:instrText>
+        </w:r>
+        <w:r>
+          <w:rPr>
+            <w:noProof/>
+            <w:webHidden/>
+          </w:rPr>
+        </w:r>
+        <w:r>
+          <w:rPr>
+            <w:noProof/>
+            <w:webHidden/>
+          </w:rPr>
+          <w:fldChar w:fldCharType="separate"/>
+        </w:r>
+        <w:r>
+          <w:rPr>
+            <w:noProof/>
+            <w:webHidden/>
+          </w:rPr>
+          <w:t>8</w:t>
+        </w:r>
+        <w:r>
+          <w:rPr>
+            <w:noProof/>
+            <w:webHidden/>
+          </w:rPr>
+          <w:fldChar w:fldCharType="end"/>
+        </w:r>
+      </w:hyperlink>
+    </w:p>
+    <w:p>
+      <w:pPr>
+        <w:pStyle w:val="TOC1"/>
+        <w:tabs>
+          <w:tab w:val="right" w:leader="dot" w:pos="9402"/>
+        </w:tabs>
+        <w:rPr>
+          <w:noProof/>
+        </w:rPr>
+      </w:pPr>
+      <w:hyperlink w:anchor="_Toc235021358" w:history="1">
+        <w:r>
+          <w:rPr>
+            <w:rStyle w:val="Hyperlink"/>
+            <w:noProof/>
+          </w:rPr>
+          <w:t>6. Simulation and Verification Plan</w:t>
+        </w:r>
+        <w:r>
+          <w:rPr>
+            <w:noProof/>
+            <w:webHidden/>
+          </w:rPr>
+          <w:tab/>
+        </w:r>
+        <w:r>
+          <w:rPr>
+            <w:noProof/>
+            <w:webHidden/>
+          </w:rPr>
+          <w:fldChar w:fldCharType="begin"/>
+        </w:r>
+        <w:r>
+          <w:rPr>
+            <w:noProof/>
+            <w:webHidden/>
+          </w:rPr>
+          <w:instrText xml:space="preserve"> PAGEREF _Toc235021358 \h </w:instrText>
+        </w:r>
+        <w:r>
+          <w:rPr>
+            <w:noProof/>
+            <w:webHidden/>
+          </w:rPr>
+        </w:r>
+        <w:r>
+          <w:rPr>
+            <w:noProof/>
+            <w:webHidden/>
+          </w:rPr>
+          <w:fldChar w:fldCharType="separate"/>
+        </w:r>
+        <w:r>
+          <w:rPr>
+            <w:noProof/>
+            <w:webHidden/>
+          </w:rPr>
+          <w:t>8</w:t>
+        </w:r>
+        <w:r>
+          <w:rPr>
+            <w:noProof/>
+            <w:webHidden/>
+          </w:rPr>
+          <w:fldChar w:fldCharType="end"/>
+        </w:r>
+      </w:hyperlink>
+    </w:p>
+    <w:p>
+      <w:pPr>
+        <w:pStyle w:val="TOC1"/>
+        <w:tabs>
+          <w:tab w:val="right" w:leader="dot" w:pos="9402"/>
+        </w:tabs>
+        <w:rPr>
+          <w:noProof/>
+        </w:rPr>
+      </w:pPr>
+      <w:hyperlink w:anchor="_Toc235021359" w:history="1">
+        <w:r>
+          <w:rPr>
+            <w:rStyle w:val="Hyperlink"/>
+            <w:noProof/>
+          </w:rPr>
+          <w:t>7. Out of Scope</w:t>
+        </w:r>
+        <w:r>
+          <w:rPr>
+            <w:noProof/>
+            <w:webHidden/>
+          </w:rPr>
+          <w:tab/>
+        </w:r>
+        <w:r>
+          <w:rPr>
+            <w:noProof/>
+            <w:webHidden/>
+          </w:rPr>
+          <w:fldChar w:fldCharType="begin"/>
+        </w:r>
+        <w:r>
+          <w:rPr>
+            <w:noProof/>
+            <w:webHidden/>
+          </w:rPr>
+          <w:instrText xml:space="preserve"> PAGEREF _Toc235021359 \h </w:instrText>
+        </w:r>
+        <w:r>
+          <w:rPr>
+            <w:noProof/>
+            <w:webHidden/>
+          </w:rPr>
+        </w:r>
+        <w:r>
+          <w:rPr>
+            <w:noProof/>
+            <w:webHidden/>
+          </w:rPr>
+          <w:fldChar w:fldCharType="separate"/>
+        </w:r>
+        <w:r>
+          <w:rPr>
+            <w:noProof/>
+            <w:webHidden/>
+          </w:rPr>
+          <w:t>8</w:t>
+        </w:r>
+        <w:r>
+          <w:rPr>
+            <w:noProof/>
+            <w:webHidden/>
+          </w:rPr>
+          <w:fldChar w:fldCharType="end"/>
+        </w:r>
+      </w:hyperlink>
+    </w:p>
+    <w:p>
+      <w:pPr>
+        <w:pStyle w:val="TOC1"/>
+        <w:tabs>
+          <w:tab w:val="right" w:leader="dot" w:pos="9402"/>
+        </w:tabs>
+        <w:rPr>
+          <w:noProof/>
+        </w:rPr>
+      </w:pPr>
+      <w:hyperlink w:anchor="_Toc235021360" w:history="1">
+        <w:r>
+          <w:rPr>
+            <w:rStyle w:val="Hyperlink"/>
+            <w:noProof/>
+          </w:rPr>
+          <w:t>8. References</w:t>
+        </w:r>
+        <w:r>
+          <w:rPr>
+            <w:noProof/>
+            <w:webHidden/>
+          </w:rPr>
+          <w:tab/>
+        </w:r>
+        <w:r>
+          <w:rPr>
+            <w:noProof/>
+            <w:webHidden/>
+          </w:rPr>
+          <w:fldChar w:fldCharType="begin"/>
+        </w:r>
+        <w:r>
+          <w:rPr>
+            <w:noProof/>
+            <w:webHidden/>
+          </w:rPr>
+          <w:instrText xml:space="preserve"> PAGEREF _Toc235021360 \h </w:instrText>
+        </w:r>
+        <w:r>
+          <w:rPr>
+            <w:noProof/>
+            <w:webHidden/>
+          </w:rPr>
+        </w:r>
+        <w:r>
+          <w:rPr>
+            <w:noProof/>
+            <w:webHidden/>
+          </w:rPr>
+          <w:fldChar w:fldCharType="separate"/>
+        </w:r>
+        <w:r>
+          <w:rPr>
+            <w:noProof/>
+            <w:webHidden/>
+          </w:rPr>
+          <w:t>8</w:t>
+        </w:r>
+        <w:r>
+          <w:rPr>
+            <w:noProof/>
+            <w:webHidden/>
+          </w:rPr>
+          <w:fldChar w:fldCharType="end"/>
+        </w:r>
+      </w:hyperlink>
+    </w:p>
+    <w:p>
+      <w:pPr>
+        <w:pStyle w:val="TOC1"/>
+        <w:tabs>
+          <w:tab w:val="right" w:leader="dot" w:pos="9402"/>
+        </w:tabs>
+        <w:rPr>
+          <w:noProof/>
+        </w:rPr>
+      </w:pPr>
+      <w:hyperlink w:anchor="_Toc235021361" w:history="1">
+        <w:r>
+          <w:rPr>
+            <w:rStyle w:val="Hyperlink"/>
+            <w:noProof/>
+          </w:rPr>
+          <w:t>Document control</w:t>
+        </w:r>
+        <w:r>
+          <w:rPr>
+            <w:noProof/>
+            <w:webHidden/>
+          </w:rPr>
+          <w:tab/>
+        </w:r>
+        <w:r>
+          <w:rPr>
+            <w:noProof/>
+            <w:webHidden/>
+          </w:rPr>
+          <w:fldChar w:fldCharType="begin"/>
+        </w:r>
+        <w:r>
+          <w:rPr>
+            <w:noProof/>
+            <w:webHidden/>
+          </w:rPr>
+          <w:instrText xml:space="preserve"> PAGEREF _Toc235021361 \h </w:instrText>
+        </w:r>
+        <w:r>
+          <w:rPr>
+            <w:noProof/>
+            <w:webHidden/>
+          </w:rPr>
+        </w:r>
+        <w:r>
+          <w:rPr>
+            <w:noProof/>
+            <w:webHidden/>
+          </w:rPr>
+          <w:fldChar w:fldCharType="separate"/>
+        </w:r>
+        <w:r>
+          <w:rPr>
+            <w:noProof/>
+            <w:webHidden/>
+          </w:rPr>
+          <w:t>9</w:t>
+        </w:r>
+        <w:r>
+          <w:rPr>
+            <w:noProof/>
+            <w:webHidden/>
+          </w:rPr>
+          <w:fldChar w:fldCharType="end"/>
+        </w:r>
+      </w:hyperlink>
+    </w:p>
+    <w:p>
       <w:r>
         <w:fldChar w:fldCharType="end"/>
       </w:r>
@@ -419,10 +2523,12 @@
       <w:pPr>
         <w:pStyle w:val="Heading1"/>
       </w:pPr>
+      <w:bookmarkStart w:id="1" w:name="_Toc235021332"/>
       <w:r>
         <w:lastRenderedPageBreak/>
         <w:t>1. Purpose and Scope</w:t>
       </w:r>
+      <w:bookmarkEnd w:id="1"/>
     </w:p>
     <w:p>
       <w:r>
@@ -433,9 +2539,11 @@
       <w:pPr>
         <w:pStyle w:val="Heading3"/>
       </w:pPr>
+      <w:bookmarkStart w:id="2" w:name="_Toc235021333"/>
       <w:r>
         <w:t>In scope of this design</w:t>
       </w:r>
+      <w:bookmarkEnd w:id="2"/>
     </w:p>
     <w:p>
       <w:pPr>
@@ -465,9 +2573,11 @@
       <w:pPr>
         <w:pStyle w:val="Heading3"/>
       </w:pPr>
+      <w:bookmarkStart w:id="3" w:name="_Toc235021334"/>
       <w:r>
         <w:t>Out of scope — deferred to the follow-on HA design phase</w:t>
       </w:r>
+      <w:bookmarkEnd w:id="3"/>
     </w:p>
     <w:p>
       <w:pPr>
@@ -497,9 +2607,11 @@
       <w:pPr>
         <w:pStyle w:val="Heading3"/>
       </w:pPr>
+      <w:bookmarkStart w:id="4" w:name="_Toc235021335"/>
       <w:r>
         <w:t>Out of MTS scope entirely — YAT ICT responsibility</w:t>
       </w:r>
+      <w:bookmarkEnd w:id="4"/>
     </w:p>
     <w:p>
       <w:pPr>
@@ -537,17 +2649,21 @@
       <w:pPr>
         <w:pStyle w:val="Heading1"/>
       </w:pPr>
+      <w:bookmarkStart w:id="5" w:name="_Toc235021336"/>
       <w:r>
         <w:t>2. Design Inputs and Requirements</w:t>
       </w:r>
+      <w:bookmarkEnd w:id="5"/>
     </w:p>
     <w:p>
       <w:pPr>
         <w:pStyle w:val="Heading3"/>
       </w:pPr>
+      <w:bookmarkStart w:id="6" w:name="_Toc235021337"/>
       <w:r>
         <w:t>2.1 Inputs</w:t>
       </w:r>
+      <w:bookmarkEnd w:id="6"/>
     </w:p>
     <w:p>
       <w:pPr>
@@ -585,9 +2701,11 @@
       <w:pPr>
         <w:pStyle w:val="Heading3"/>
       </w:pPr>
+      <w:bookmarkStart w:id="7" w:name="_Toc235021338"/>
       <w:r>
         <w:t>2.2 Requirements the design must meet</w:t>
       </w:r>
+      <w:bookmarkEnd w:id="7"/>
     </w:p>
     <w:tbl>
       <w:tblPr>
@@ -925,9 +3043,11 @@
       <w:pPr>
         <w:pStyle w:val="Heading1"/>
       </w:pPr>
+      <w:bookmarkStart w:id="8" w:name="_Toc235021339"/>
       <w:r>
         <w:t>3. Review of Existing Architecture</w:t>
       </w:r>
+      <w:bookmarkEnd w:id="8"/>
     </w:p>
     <w:p>
       <w:r>
@@ -942,17 +3062,21 @@
       <w:pPr>
         <w:pStyle w:val="Heading1"/>
       </w:pPr>
+      <w:bookmarkStart w:id="9" w:name="_Toc235021340"/>
       <w:r>
         <w:t>4. Architecture Design</w:t>
       </w:r>
+      <w:bookmarkEnd w:id="9"/>
     </w:p>
     <w:p>
       <w:pPr>
         <w:pStyle w:val="Heading3"/>
       </w:pPr>
+      <w:bookmarkStart w:id="10" w:name="_Toc235021341"/>
       <w:r>
         <w:t>4.1 Assumptions and constraints</w:t>
       </w:r>
+      <w:bookmarkEnd w:id="10"/>
     </w:p>
     <w:tbl>
       <w:tblPr>
@@ -1483,9 +3607,11 @@
       <w:pPr>
         <w:pStyle w:val="Heading3"/>
       </w:pPr>
+      <w:bookmarkStart w:id="11" w:name="_Toc235021342"/>
       <w:r>
         <w:t>4.2 AWS account and region</w:t>
       </w:r>
+      <w:bookmarkEnd w:id="11"/>
     </w:p>
     <w:p>
       <w:r>
@@ -1496,9 +3622,11 @@
       <w:pPr>
         <w:pStyle w:val="Heading3"/>
       </w:pPr>
+      <w:bookmarkStart w:id="12" w:name="_Toc235021343"/>
       <w:r>
         <w:t>4.3 Identity and Access Management (IAM)</w:t>
       </w:r>
+      <w:bookmarkEnd w:id="12"/>
     </w:p>
     <w:tbl>
       <w:tblPr>
@@ -1865,9 +3993,11 @@
       <w:pPr>
         <w:pStyle w:val="Heading3"/>
       </w:pPr>
+      <w:bookmarkStart w:id="13" w:name="_Toc235021344"/>
       <w:r>
         <w:t>4.4 Network topology</w:t>
       </w:r>
+      <w:bookmarkEnd w:id="13"/>
     </w:p>
     <w:p>
       <w:r>
@@ -2290,6 +4420,7 @@
             <w:r>
               <w:rPr>
                 <w:b/>
+                <w:noProof/>
                 <w:color w:val="C5613B"/>
                 <w:sz w:val="22"/>
               </w:rPr>
@@ -2356,9 +4487,11 @@
       <w:pPr>
         <w:pStyle w:val="Heading3"/>
       </w:pPr>
+      <w:bookmarkStart w:id="14" w:name="_Toc235021345"/>
       <w:r>
         <w:t>4.5 Compute (EC2 + Auto Scaling)</w:t>
       </w:r>
+      <w:bookmarkEnd w:id="14"/>
     </w:p>
     <w:p>
       <w:pPr>
@@ -2396,10 +4529,12 @@
       <w:pPr>
         <w:pStyle w:val="Heading3"/>
       </w:pPr>
+      <w:bookmarkStart w:id="15" w:name="_Toc235021346"/>
       <w:r>
         <w:lastRenderedPageBreak/>
         <w:t>4.6 Load balancing (ALB)</w:t>
       </w:r>
+      <w:bookmarkEnd w:id="15"/>
     </w:p>
     <w:p>
       <w:pPr>
@@ -2429,9 +4564,11 @@
       <w:pPr>
         <w:pStyle w:val="Heading3"/>
       </w:pPr>
+      <w:bookmarkStart w:id="16" w:name="_Toc235021347"/>
       <w:r>
         <w:t>4.7 Database (RDS)</w:t>
       </w:r>
+      <w:bookmarkEnd w:id="16"/>
     </w:p>
     <w:p>
       <w:pPr>
@@ -2477,9 +4614,11 @@
       <w:pPr>
         <w:pStyle w:val="Heading3"/>
       </w:pPr>
+      <w:bookmarkStart w:id="17" w:name="_Toc235021348"/>
       <w:r>
         <w:t>4.8 Storage</w:t>
       </w:r>
+      <w:bookmarkEnd w:id="17"/>
     </w:p>
     <w:tbl>
       <w:tblPr>
@@ -2829,9 +4968,11 @@
       <w:pPr>
         <w:pStyle w:val="Heading3"/>
       </w:pPr>
+      <w:bookmarkStart w:id="18" w:name="_Toc235021349"/>
       <w:r>
         <w:t>4.9 Security</w:t>
       </w:r>
+      <w:bookmarkEnd w:id="18"/>
     </w:p>
     <w:tbl>
       <w:tblPr>
@@ -3134,9 +5275,11 @@
       <w:pPr>
         <w:pStyle w:val="Heading3"/>
       </w:pPr>
+      <w:bookmarkStart w:id="19" w:name="_Toc235021350"/>
       <w:r>
         <w:t>4.10 Monitoring (baseline)</w:t>
       </w:r>
+      <w:bookmarkEnd w:id="19"/>
     </w:p>
     <w:p>
       <w:r>
@@ -3440,9 +5583,11 @@
       <w:pPr>
         <w:pStyle w:val="Heading3"/>
       </w:pPr>
+      <w:bookmarkStart w:id="20" w:name="_Toc235021351"/>
       <w:r>
         <w:t>4.11 Naming and tagging conventions</w:t>
       </w:r>
+      <w:bookmarkEnd w:id="20"/>
     </w:p>
     <w:p>
       <w:r>
@@ -3778,9 +5923,11 @@
       <w:pPr>
         <w:pStyle w:val="Heading3"/>
       </w:pPr>
+      <w:bookmarkStart w:id="21" w:name="_Toc235021352"/>
       <w:r>
         <w:t>4.12 Backup</w:t>
       </w:r>
+      <w:bookmarkEnd w:id="21"/>
     </w:p>
     <w:tbl>
       <w:tblPr>
@@ -4067,9 +6214,11 @@
       <w:pPr>
         <w:pStyle w:val="Heading3"/>
       </w:pPr>
+      <w:bookmarkStart w:id="22" w:name="_Toc235021353"/>
       <w:r>
         <w:t>4.13 Recovery objectives — baseline state</w:t>
       </w:r>
+      <w:bookmarkEnd w:id="22"/>
     </w:p>
     <w:p>
       <w:r>
@@ -4080,9 +6229,11 @@
       <w:pPr>
         <w:pStyle w:val="Heading3"/>
       </w:pPr>
+      <w:bookmarkStart w:id="23" w:name="_Toc235021354"/>
       <w:r>
         <w:t>4.14 Components requiring vertical scaling</w:t>
       </w:r>
+      <w:bookmarkEnd w:id="23"/>
     </w:p>
     <w:p>
       <w:r>
@@ -4093,9 +6244,11 @@
       <w:pPr>
         <w:pStyle w:val="Heading3"/>
       </w:pPr>
+      <w:bookmarkStart w:id="24" w:name="_Toc235021355"/>
       <w:r>
         <w:t>4.15 Single points of failure removed</w:t>
       </w:r>
+      <w:bookmarkEnd w:id="24"/>
     </w:p>
     <w:p>
       <w:r>
@@ -4110,10 +6263,12 @@
       <w:pPr>
         <w:pStyle w:val="Heading3"/>
       </w:pPr>
+      <w:bookmarkStart w:id="25" w:name="_Toc235021356"/>
       <w:r>
         <w:lastRenderedPageBreak/>
         <w:t>4.16 Configuration decisions left to the implementer</w:t>
       </w:r>
+      <w:bookmarkEnd w:id="25"/>
     </w:p>
     <w:p>
       <w:r>
@@ -4712,9 +6867,11 @@
       <w:pPr>
         <w:pStyle w:val="Heading1"/>
       </w:pPr>
+      <w:bookmarkStart w:id="26" w:name="_Toc235021357"/>
       <w:r>
         <w:t>5. Implementation Sequencing</w:t>
       </w:r>
+      <w:bookmarkEnd w:id="26"/>
     </w:p>
     <w:p>
       <w:r>
@@ -4729,9 +6886,11 @@
       <w:pPr>
         <w:pStyle w:val="Heading1"/>
       </w:pPr>
+      <w:bookmarkStart w:id="27" w:name="_Toc235021358"/>
       <w:r>
         <w:t>6. Simulation and Verification Plan</w:t>
       </w:r>
+      <w:bookmarkEnd w:id="27"/>
     </w:p>
     <w:p>
       <w:r>
@@ -4746,9 +6905,11 @@
       <w:pPr>
         <w:pStyle w:val="Heading1"/>
       </w:pPr>
+      <w:bookmarkStart w:id="28" w:name="_Toc235021359"/>
       <w:r>
         <w:t>7. Out of Scope</w:t>
       </w:r>
+      <w:bookmarkEnd w:id="28"/>
     </w:p>
     <w:p>
       <w:r>
@@ -4791,9 +6952,11 @@
       <w:pPr>
         <w:pStyle w:val="Heading1"/>
       </w:pPr>
+      <w:bookmarkStart w:id="29" w:name="_Toc235021360"/>
       <w:r>
         <w:t>8. References</w:t>
       </w:r>
+      <w:bookmarkEnd w:id="29"/>
     </w:p>
     <w:p>
       <w:pPr>
@@ -4823,10 +6986,12 @@
       <w:pPr>
         <w:pStyle w:val="Heading1"/>
       </w:pPr>
+      <w:bookmarkStart w:id="30" w:name="_Toc235021361"/>
       <w:r>
         <w:lastRenderedPageBreak/>
         <w:t>Document control</w:t>
       </w:r>
+      <w:bookmarkEnd w:id="30"/>
     </w:p>
     <w:tbl>
       <w:tblPr>
@@ -5122,7 +7287,7 @@
 </file>
 
 <file path=word/endnotes.xml><?xml version="1.0" encoding="utf-8"?>
-<w:endnotes xmlns:wpc="http://schemas.microsoft.com/office/word/2010/wordprocessingCanvas" xmlns:cx="http://schemas.microsoft.com/office/drawing/2014/chartex" xmlns:cx1="http://schemas.microsoft.com/office/drawing/2015/9/8/chartex" xmlns:cx2="http://schemas.microsoft.com/office/drawing/2015/10/21/chartex" xmlns:cx3="http://schemas.microsoft.com/office/drawing/2016/5/9/chartex" xmlns:cx4="http://schemas.microsoft.com/office/drawing/2016/5/10/chartex" xmlns:cx5="http://schemas.microsoft.com/office/drawing/2016/5/11/chartex" xmlns:cx6="http://schemas.microsoft.com/office/drawing/2016/5/12/chartex" xmlns:cx7="http://schemas.microsoft.com/office/drawing/2016/5/13/chartex" xmlns:cx8="http://schemas.microsoft.com/office/drawing/2016/5/14/chartex" xmlns:mc="http://schemas.openxmlformats.org/markup-compatibility/2006" xmlns:aink="http://schemas.microsoft.com/office/drawing/2016/ink" xmlns:am3d="http://schemas.microsoft.com/office/drawing/2017/model3d" xmlns:o="urn:schemas-microsoft-com:office:office" xmlns:oel="http://schemas.microsoft.com/office/2019/extlst" xmlns:r="http://schemas.openxmlformats.org/officeDocument/2006/relationships" xmlns:m="http://schemas.openxmlformats.org/officeDocument/2006/math" xmlns:v="urn:schemas-microsoft-com:vml" xmlns:wp14="http://schemas.microsoft.com/office/word/2010/wordprocessingDrawing" xmlns:wp="http://schemas.openxmlformats.org/drawingml/2006/wordprocessingDrawing" xmlns:w10="urn:schemas-microsoft-com:office:word" xmlns:w="http://schemas.openxmlformats.org/wordprocessingml/2006/main" xmlns:w14="http://schemas.microsoft.com/office/word/2010/wordml" xmlns:w15="http://schemas.microsoft.com/office/word/2012/wordml" xmlns:w16cex="http://schemas.microsoft.com/office/word/2018/wordml/cex" xmlns:w16cid="http://schemas.microsoft.com/office/word/2016/wordml/cid" xmlns:w16="http://schemas.microsoft.com/office/word/2018/wordml" xmlns:w16du="http://schemas.microsoft.com/office/word/2023/wordml/word16du" xmlns:w16sdtdh="http://schemas.microsoft.com/office/word/2020/wordml/sdtdatahash" xmlns:w16sdtfl="http://schemas.microsoft.com/office/word/2024/wordml/sdtformatlock" xmlns:w16se="http://schemas.microsoft.com/office/word/2015/wordml/symex" xmlns:wpg="http://schemas.microsoft.com/office/word/2010/wordprocessingGroup" xmlns:wpi="http://schemas.microsoft.com/office/word/2010/wordprocessingInk" xmlns:wne="http://schemas.microsoft.com/office/word/2006/wordml" xmlns:wps="http://schemas.microsoft.com/office/word/2010/wordprocessingShape" mc:Ignorable="w14 w15 w16se w16cid w16 w16cex w16sdtdh w16sdtfl w16du wp14">
+<w:endnotes xmlns:wpc="http://schemas.microsoft.com/office/word/2010/wordprocessingCanvas" xmlns:cx="http://schemas.microsoft.com/office/drawing/2014/chartex" xmlns:cx1="http://schemas.microsoft.com/office/drawing/2015/9/8/chartex" xmlns:cx2="http://schemas.microsoft.com/office/drawing/2015/10/21/chartex" xmlns:cx3="http://schemas.microsoft.com/office/drawing/2016/5/9/chartex" xmlns:cx4="http://schemas.microsoft.com/office/drawing/2016/5/10/chartex" xmlns:cx5="http://schemas.microsoft.com/office/drawing/2016/5/11/chartex" xmlns:cx6="http://schemas.microsoft.com/office/drawing/2016/5/12/chartex" xmlns:cx7="http://schemas.microsoft.com/office/drawing/2016/5/13/chartex" xmlns:cx8="http://schemas.microsoft.com/office/drawing/2016/5/14/chartex" xmlns:mc="http://schemas.openxmlformats.org/markup-compatibility/2006" xmlns:m="http://schemas.openxmlformats.org/officeDocument/2006/math" xmlns:aink="http://schemas.microsoft.com/office/drawing/2016/ink" xmlns:am3d="http://schemas.microsoft.com/office/drawing/2017/model3d" xmlns:oel="http://schemas.microsoft.com/office/2019/extlst" xmlns:r="http://schemas.openxmlformats.org/officeDocument/2006/relationships" xmlns:wp14="http://schemas.microsoft.com/office/word/2010/wordprocessingDrawing" xmlns:wp="http://schemas.openxmlformats.org/drawingml/2006/wordprocessingDrawing" xmlns:wpg="http://schemas.microsoft.com/office/word/2010/wordprocessingGroup" xmlns:wpi="http://schemas.microsoft.com/office/word/2010/wordprocessingInk" xmlns:wps="http://schemas.microsoft.com/office/word/2010/wordprocessingShape" xmlns:o="urn:schemas-microsoft-com:office:office" xmlns:v="urn:schemas-microsoft-com:vml" xmlns:w10="urn:schemas-microsoft-com:office:word" xmlns:w="http://schemas.openxmlformats.org/wordprocessingml/2006/main" xmlns:w14="http://schemas.microsoft.com/office/word/2010/wordml" xmlns:w15="http://schemas.microsoft.com/office/word/2012/wordml" xmlns:w16cei="http://schemas.microsoft.com/office/word/2026/wordml/cei" xmlns:w16cex="http://schemas.microsoft.com/office/word/2018/wordml/cex" xmlns:w16cid="http://schemas.microsoft.com/office/word/2016/wordml/cid" xmlns:w16="http://schemas.microsoft.com/office/word/2018/wordml" xmlns:w16sdtdh="http://schemas.microsoft.com/office/word/2020/wordml/sdtdatahash" xmlns:w16sdtfl="http://schemas.microsoft.com/office/word/2024/wordml/sdtformatlock" xmlns:w16se="http://schemas.microsoft.com/office/word/2015/wordml/symex" xmlns:w16du="http://schemas.microsoft.com/office/word/2023/wordml/word16du" xmlns:wne="http://schemas.microsoft.com/office/word/2006/wordml" mc:Ignorable="w14 w15 w16se w16cid w16 w16cex w16sdtdh w16sdtfl w16du wp14">
   <w:endnote w:type="separator" w:id="-1">
     <w:p>
       <w:pPr>
@@ -5147,7 +7312,7 @@
 </file>
 
 <file path=word/footer1.xml><?xml version="1.0" encoding="utf-8"?>
-<w:ftr xmlns:wpc="http://schemas.microsoft.com/office/word/2010/wordprocessingCanvas" xmlns:cx="http://schemas.microsoft.com/office/drawing/2014/chartex" xmlns:cx1="http://schemas.microsoft.com/office/drawing/2015/9/8/chartex" xmlns:cx2="http://schemas.microsoft.com/office/drawing/2015/10/21/chartex" xmlns:cx3="http://schemas.microsoft.com/office/drawing/2016/5/9/chartex" xmlns:cx4="http://schemas.microsoft.com/office/drawing/2016/5/10/chartex" xmlns:cx5="http://schemas.microsoft.com/office/drawing/2016/5/11/chartex" xmlns:cx6="http://schemas.microsoft.com/office/drawing/2016/5/12/chartex" xmlns:cx7="http://schemas.microsoft.com/office/drawing/2016/5/13/chartex" xmlns:cx8="http://schemas.microsoft.com/office/drawing/2016/5/14/chartex" xmlns:mc="http://schemas.openxmlformats.org/markup-compatibility/2006" xmlns:aink="http://schemas.microsoft.com/office/drawing/2016/ink" xmlns:am3d="http://schemas.microsoft.com/office/drawing/2017/model3d" xmlns:o="urn:schemas-microsoft-com:office:office" xmlns:oel="http://schemas.microsoft.com/office/2019/extlst" xmlns:r="http://schemas.openxmlformats.org/officeDocument/2006/relationships" xmlns:m="http://schemas.openxmlformats.org/officeDocument/2006/math" xmlns:v="urn:schemas-microsoft-com:vml" xmlns:wp14="http://schemas.microsoft.com/office/word/2010/wordprocessingDrawing" xmlns:wp="http://schemas.openxmlformats.org/drawingml/2006/wordprocessingDrawing" xmlns:w10="urn:schemas-microsoft-com:office:word" xmlns:w="http://schemas.openxmlformats.org/wordprocessingml/2006/main" xmlns:w14="http://schemas.microsoft.com/office/word/2010/wordml" xmlns:w15="http://schemas.microsoft.com/office/word/2012/wordml" xmlns:w16cex="http://schemas.microsoft.com/office/word/2018/wordml/cex" xmlns:w16cid="http://schemas.microsoft.com/office/word/2016/wordml/cid" xmlns:w16="http://schemas.microsoft.com/office/word/2018/wordml" xmlns:w16du="http://schemas.microsoft.com/office/word/2023/wordml/word16du" xmlns:w16sdtdh="http://schemas.microsoft.com/office/word/2020/wordml/sdtdatahash" xmlns:w16sdtfl="http://schemas.microsoft.com/office/word/2024/wordml/sdtformatlock" xmlns:w16se="http://schemas.microsoft.com/office/word/2015/wordml/symex" xmlns:wpg="http://schemas.microsoft.com/office/word/2010/wordprocessingGroup" xmlns:wpi="http://schemas.microsoft.com/office/word/2010/wordprocessingInk" xmlns:wne="http://schemas.microsoft.com/office/word/2006/wordml" xmlns:wps="http://schemas.microsoft.com/office/word/2010/wordprocessingShape" mc:Ignorable="w14 w15 w16se w16cid w16 w16cex w16sdtdh w16sdtfl w16du wp14">
+<w:ftr xmlns:wpc="http://schemas.microsoft.com/office/word/2010/wordprocessingCanvas" xmlns:cx="http://schemas.microsoft.com/office/drawing/2014/chartex" xmlns:cx1="http://schemas.microsoft.com/office/drawing/2015/9/8/chartex" xmlns:cx2="http://schemas.microsoft.com/office/drawing/2015/10/21/chartex" xmlns:cx3="http://schemas.microsoft.com/office/drawing/2016/5/9/chartex" xmlns:cx4="http://schemas.microsoft.com/office/drawing/2016/5/10/chartex" xmlns:cx5="http://schemas.microsoft.com/office/drawing/2016/5/11/chartex" xmlns:cx6="http://schemas.microsoft.com/office/drawing/2016/5/12/chartex" xmlns:cx7="http://schemas.microsoft.com/office/drawing/2016/5/13/chartex" xmlns:cx8="http://schemas.microsoft.com/office/drawing/2016/5/14/chartex" xmlns:mc="http://schemas.openxmlformats.org/markup-compatibility/2006" xmlns:m="http://schemas.openxmlformats.org/officeDocument/2006/math" xmlns:aink="http://schemas.microsoft.com/office/drawing/2016/ink" xmlns:am3d="http://schemas.microsoft.com/office/drawing/2017/model3d" xmlns:oel="http://schemas.microsoft.com/office/2019/extlst" xmlns:r="http://schemas.openxmlformats.org/officeDocument/2006/relationships" xmlns:wp14="http://schemas.microsoft.com/office/word/2010/wordprocessingDrawing" xmlns:wp="http://schemas.openxmlformats.org/drawingml/2006/wordprocessingDrawing" xmlns:wpg="http://schemas.microsoft.com/office/word/2010/wordprocessingGroup" xmlns:wpi="http://schemas.microsoft.com/office/word/2010/wordprocessingInk" xmlns:wps="http://schemas.microsoft.com/office/word/2010/wordprocessingShape" xmlns:o="urn:schemas-microsoft-com:office:office" xmlns:v="urn:schemas-microsoft-com:vml" xmlns:w10="urn:schemas-microsoft-com:office:word" xmlns:w="http://schemas.openxmlformats.org/wordprocessingml/2006/main" xmlns:w14="http://schemas.microsoft.com/office/word/2010/wordml" xmlns:w15="http://schemas.microsoft.com/office/word/2012/wordml" xmlns:w16cei="http://schemas.microsoft.com/office/word/2026/wordml/cei" xmlns:w16cex="http://schemas.microsoft.com/office/word/2018/wordml/cex" xmlns:w16cid="http://schemas.microsoft.com/office/word/2016/wordml/cid" xmlns:w16="http://schemas.microsoft.com/office/word/2018/wordml" xmlns:w16sdtdh="http://schemas.microsoft.com/office/word/2020/wordml/sdtdatahash" xmlns:w16sdtfl="http://schemas.microsoft.com/office/word/2024/wordml/sdtformatlock" xmlns:w16se="http://schemas.microsoft.com/office/word/2015/wordml/symex" xmlns:w16du="http://schemas.microsoft.com/office/word/2023/wordml/word16du" xmlns:wne="http://schemas.microsoft.com/office/word/2006/wordml" mc:Ignorable="w14 w15 w16se w16cid w16 w16cex w16sdtdh w16sdtfl w16du wp14">
   <w:p>
     <w:pPr>
       <w:pStyle w:val="Footer"/>
@@ -5225,7 +7390,7 @@
 </file>
 
 <file path=word/footer2.xml><?xml version="1.0" encoding="utf-8"?>
-<w:ftr xmlns:wpc="http://schemas.microsoft.com/office/word/2010/wordprocessingCanvas" xmlns:cx="http://schemas.microsoft.com/office/drawing/2014/chartex" xmlns:cx1="http://schemas.microsoft.com/office/drawing/2015/9/8/chartex" xmlns:cx2="http://schemas.microsoft.com/office/drawing/2015/10/21/chartex" xmlns:cx3="http://schemas.microsoft.com/office/drawing/2016/5/9/chartex" xmlns:cx4="http://schemas.microsoft.com/office/drawing/2016/5/10/chartex" xmlns:cx5="http://schemas.microsoft.com/office/drawing/2016/5/11/chartex" xmlns:cx6="http://schemas.microsoft.com/office/drawing/2016/5/12/chartex" xmlns:cx7="http://schemas.microsoft.com/office/drawing/2016/5/13/chartex" xmlns:cx8="http://schemas.microsoft.com/office/drawing/2016/5/14/chartex" xmlns:mc="http://schemas.openxmlformats.org/markup-compatibility/2006" xmlns:aink="http://schemas.microsoft.com/office/drawing/2016/ink" xmlns:am3d="http://schemas.microsoft.com/office/drawing/2017/model3d" xmlns:o="urn:schemas-microsoft-com:office:office" xmlns:oel="http://schemas.microsoft.com/office/2019/extlst" xmlns:r="http://schemas.openxmlformats.org/officeDocument/2006/relationships" xmlns:m="http://schemas.openxmlformats.org/officeDocument/2006/math" xmlns:v="urn:schemas-microsoft-com:vml" xmlns:wp14="http://schemas.microsoft.com/office/word/2010/wordprocessingDrawing" xmlns:wp="http://schemas.openxmlformats.org/drawingml/2006/wordprocessingDrawing" xmlns:w10="urn:schemas-microsoft-com:office:word" xmlns:w="http://schemas.openxmlformats.org/wordprocessingml/2006/main" xmlns:w14="http://schemas.microsoft.com/office/word/2010/wordml" xmlns:w15="http://schemas.microsoft.com/office/word/2012/wordml" xmlns:w16cex="http://schemas.microsoft.com/office/word/2018/wordml/cex" xmlns:w16cid="http://schemas.microsoft.com/office/word/2016/wordml/cid" xmlns:w16="http://schemas.microsoft.com/office/word/2018/wordml" xmlns:w16du="http://schemas.microsoft.com/office/word/2023/wordml/word16du" xmlns:w16sdtdh="http://schemas.microsoft.com/office/word/2020/wordml/sdtdatahash" xmlns:w16sdtfl="http://schemas.microsoft.com/office/word/2024/wordml/sdtformatlock" xmlns:w16se="http://schemas.microsoft.com/office/word/2015/wordml/symex" xmlns:wpg="http://schemas.microsoft.com/office/word/2010/wordprocessingGroup" xmlns:wpi="http://schemas.microsoft.com/office/word/2010/wordprocessingInk" xmlns:wne="http://schemas.microsoft.com/office/word/2006/wordml" xmlns:wps="http://schemas.microsoft.com/office/word/2010/wordprocessingShape" mc:Ignorable="w14 w15 w16se w16cid w16 w16cex w16sdtdh w16sdtfl w16du wp14">
+<w:ftr xmlns:wpc="http://schemas.microsoft.com/office/word/2010/wordprocessingCanvas" xmlns:cx="http://schemas.microsoft.com/office/drawing/2014/chartex" xmlns:cx1="http://schemas.microsoft.com/office/drawing/2015/9/8/chartex" xmlns:cx2="http://schemas.microsoft.com/office/drawing/2015/10/21/chartex" xmlns:cx3="http://schemas.microsoft.com/office/drawing/2016/5/9/chartex" xmlns:cx4="http://schemas.microsoft.com/office/drawing/2016/5/10/chartex" xmlns:cx5="http://schemas.microsoft.com/office/drawing/2016/5/11/chartex" xmlns:cx6="http://schemas.microsoft.com/office/drawing/2016/5/12/chartex" xmlns:cx7="http://schemas.microsoft.com/office/drawing/2016/5/13/chartex" xmlns:cx8="http://schemas.microsoft.com/office/drawing/2016/5/14/chartex" xmlns:mc="http://schemas.openxmlformats.org/markup-compatibility/2006" xmlns:m="http://schemas.openxmlformats.org/officeDocument/2006/math" xmlns:aink="http://schemas.microsoft.com/office/drawing/2016/ink" xmlns:am3d="http://schemas.microsoft.com/office/drawing/2017/model3d" xmlns:oel="http://schemas.microsoft.com/office/2019/extlst" xmlns:r="http://schemas.openxmlformats.org/officeDocument/2006/relationships" xmlns:wp14="http://schemas.microsoft.com/office/word/2010/wordprocessingDrawing" xmlns:wp="http://schemas.openxmlformats.org/drawingml/2006/wordprocessingDrawing" xmlns:wpg="http://schemas.microsoft.com/office/word/2010/wordprocessingGroup" xmlns:wpi="http://schemas.microsoft.com/office/word/2010/wordprocessingInk" xmlns:wps="http://schemas.microsoft.com/office/word/2010/wordprocessingShape" xmlns:o="urn:schemas-microsoft-com:office:office" xmlns:v="urn:schemas-microsoft-com:vml" xmlns:w10="urn:schemas-microsoft-com:office:word" xmlns:w="http://schemas.openxmlformats.org/wordprocessingml/2006/main" xmlns:w14="http://schemas.microsoft.com/office/word/2010/wordml" xmlns:w15="http://schemas.microsoft.com/office/word/2012/wordml" xmlns:w16cei="http://schemas.microsoft.com/office/word/2026/wordml/cei" xmlns:w16cex="http://schemas.microsoft.com/office/word/2018/wordml/cex" xmlns:w16cid="http://schemas.microsoft.com/office/word/2016/wordml/cid" xmlns:w16="http://schemas.microsoft.com/office/word/2018/wordml" xmlns:w16sdtdh="http://schemas.microsoft.com/office/word/2020/wordml/sdtdatahash" xmlns:w16sdtfl="http://schemas.microsoft.com/office/word/2024/wordml/sdtformatlock" xmlns:w16se="http://schemas.microsoft.com/office/word/2015/wordml/symex" xmlns:w16du="http://schemas.microsoft.com/office/word/2023/wordml/word16du" xmlns:wne="http://schemas.microsoft.com/office/word/2006/wordml" mc:Ignorable="w14 w15 w16se w16cid w16 w16cex w16sdtdh w16sdtfl w16du wp14">
   <w:p>
     <w:pPr>
       <w:pStyle w:val="Footer"/>
@@ -5303,7 +7468,7 @@
 </file>
 
 <file path=word/footer3.xml><?xml version="1.0" encoding="utf-8"?>
-<w:ftr xmlns:wpc="http://schemas.microsoft.com/office/word/2010/wordprocessingCanvas" xmlns:cx="http://schemas.microsoft.com/office/drawing/2014/chartex" xmlns:cx1="http://schemas.microsoft.com/office/drawing/2015/9/8/chartex" xmlns:cx2="http://schemas.microsoft.com/office/drawing/2015/10/21/chartex" xmlns:cx3="http://schemas.microsoft.com/office/drawing/2016/5/9/chartex" xmlns:cx4="http://schemas.microsoft.com/office/drawing/2016/5/10/chartex" xmlns:cx5="http://schemas.microsoft.com/office/drawing/2016/5/11/chartex" xmlns:cx6="http://schemas.microsoft.com/office/drawing/2016/5/12/chartex" xmlns:cx7="http://schemas.microsoft.com/office/drawing/2016/5/13/chartex" xmlns:cx8="http://schemas.microsoft.com/office/drawing/2016/5/14/chartex" xmlns:mc="http://schemas.openxmlformats.org/markup-compatibility/2006" xmlns:aink="http://schemas.microsoft.com/office/drawing/2016/ink" xmlns:am3d="http://schemas.microsoft.com/office/drawing/2017/model3d" xmlns:o="urn:schemas-microsoft-com:office:office" xmlns:oel="http://schemas.microsoft.com/office/2019/extlst" xmlns:r="http://schemas.openxmlformats.org/officeDocument/2006/relationships" xmlns:m="http://schemas.openxmlformats.org/officeDocument/2006/math" xmlns:v="urn:schemas-microsoft-com:vml" xmlns:wp14="http://schemas.microsoft.com/office/word/2010/wordprocessingDrawing" xmlns:wp="http://schemas.openxmlformats.org/drawingml/2006/wordprocessingDrawing" xmlns:w10="urn:schemas-microsoft-com:office:word" xmlns:w="http://schemas.openxmlformats.org/wordprocessingml/2006/main" xmlns:w14="http://schemas.microsoft.com/office/word/2010/wordml" xmlns:w15="http://schemas.microsoft.com/office/word/2012/wordml" xmlns:w16cex="http://schemas.microsoft.com/office/word/2018/wordml/cex" xmlns:w16cid="http://schemas.microsoft.com/office/word/2016/wordml/cid" xmlns:w16="http://schemas.microsoft.com/office/word/2018/wordml" xmlns:w16du="http://schemas.microsoft.com/office/word/2023/wordml/word16du" xmlns:w16sdtdh="http://schemas.microsoft.com/office/word/2020/wordml/sdtdatahash" xmlns:w16sdtfl="http://schemas.microsoft.com/office/word/2024/wordml/sdtformatlock" xmlns:w16se="http://schemas.microsoft.com/office/word/2015/wordml/symex" xmlns:wpg="http://schemas.microsoft.com/office/word/2010/wordprocessingGroup" xmlns:wpi="http://schemas.microsoft.com/office/word/2010/wordprocessingInk" xmlns:wne="http://schemas.microsoft.com/office/word/2006/wordml" xmlns:wps="http://schemas.microsoft.com/office/word/2010/wordprocessingShape" mc:Ignorable="w14 w15 w16se w16cid w16 w16cex w16sdtdh w16sdtfl w16du wp14">
+<w:ftr xmlns:wpc="http://schemas.microsoft.com/office/word/2010/wordprocessingCanvas" xmlns:cx="http://schemas.microsoft.com/office/drawing/2014/chartex" xmlns:cx1="http://schemas.microsoft.com/office/drawing/2015/9/8/chartex" xmlns:cx2="http://schemas.microsoft.com/office/drawing/2015/10/21/chartex" xmlns:cx3="http://schemas.microsoft.com/office/drawing/2016/5/9/chartex" xmlns:cx4="http://schemas.microsoft.com/office/drawing/2016/5/10/chartex" xmlns:cx5="http://schemas.microsoft.com/office/drawing/2016/5/11/chartex" xmlns:cx6="http://schemas.microsoft.com/office/drawing/2016/5/12/chartex" xmlns:cx7="http://schemas.microsoft.com/office/drawing/2016/5/13/chartex" xmlns:cx8="http://schemas.microsoft.com/office/drawing/2016/5/14/chartex" xmlns:mc="http://schemas.openxmlformats.org/markup-compatibility/2006" xmlns:m="http://schemas.openxmlformats.org/officeDocument/2006/math" xmlns:aink="http://schemas.microsoft.com/office/drawing/2016/ink" xmlns:am3d="http://schemas.microsoft.com/office/drawing/2017/model3d" xmlns:oel="http://schemas.microsoft.com/office/2019/extlst" xmlns:r="http://schemas.openxmlformats.org/officeDocument/2006/relationships" xmlns:wp14="http://schemas.microsoft.com/office/word/2010/wordprocessingDrawing" xmlns:wp="http://schemas.openxmlformats.org/drawingml/2006/wordprocessingDrawing" xmlns:wpg="http://schemas.microsoft.com/office/word/2010/wordprocessingGroup" xmlns:wpi="http://schemas.microsoft.com/office/word/2010/wordprocessingInk" xmlns:wps="http://schemas.microsoft.com/office/word/2010/wordprocessingShape" xmlns:o="urn:schemas-microsoft-com:office:office" xmlns:v="urn:schemas-microsoft-com:vml" xmlns:w10="urn:schemas-microsoft-com:office:word" xmlns:w="http://schemas.openxmlformats.org/wordprocessingml/2006/main" xmlns:w14="http://schemas.microsoft.com/office/word/2010/wordml" xmlns:w15="http://schemas.microsoft.com/office/word/2012/wordml" xmlns:w16cei="http://schemas.microsoft.com/office/word/2026/wordml/cei" xmlns:w16cex="http://schemas.microsoft.com/office/word/2018/wordml/cex" xmlns:w16cid="http://schemas.microsoft.com/office/word/2016/wordml/cid" xmlns:w16="http://schemas.microsoft.com/office/word/2018/wordml" xmlns:w16sdtdh="http://schemas.microsoft.com/office/word/2020/wordml/sdtdatahash" xmlns:w16sdtfl="http://schemas.microsoft.com/office/word/2024/wordml/sdtformatlock" xmlns:w16se="http://schemas.microsoft.com/office/word/2015/wordml/symex" xmlns:w16du="http://schemas.microsoft.com/office/word/2023/wordml/word16du" xmlns:wne="http://schemas.microsoft.com/office/word/2006/wordml" mc:Ignorable="w14 w15 w16se w16cid w16 w16cex w16sdtdh w16sdtfl w16du wp14">
   <w:p>
     <w:pPr>
       <w:pStyle w:val="Footer"/>
@@ -5381,7 +7546,7 @@
 </file>
 
 <file path=word/footnotes.xml><?xml version="1.0" encoding="utf-8"?>
-<w:footnotes xmlns:wpc="http://schemas.microsoft.com/office/word/2010/wordprocessingCanvas" xmlns:cx="http://schemas.microsoft.com/office/drawing/2014/chartex" xmlns:cx1="http://schemas.microsoft.com/office/drawing/2015/9/8/chartex" xmlns:cx2="http://schemas.microsoft.com/office/drawing/2015/10/21/chartex" xmlns:cx3="http://schemas.microsoft.com/office/drawing/2016/5/9/chartex" xmlns:cx4="http://schemas.microsoft.com/office/drawing/2016/5/10/chartex" xmlns:cx5="http://schemas.microsoft.com/office/drawing/2016/5/11/chartex" xmlns:cx6="http://schemas.microsoft.com/office/drawing/2016/5/12/chartex" xmlns:cx7="http://schemas.microsoft.com/office/drawing/2016/5/13/chartex" xmlns:cx8="http://schemas.microsoft.com/office/drawing/2016/5/14/chartex" xmlns:mc="http://schemas.openxmlformats.org/markup-compatibility/2006" xmlns:aink="http://schemas.microsoft.com/office/drawing/2016/ink" xmlns:am3d="http://schemas.microsoft.com/office/drawing/2017/model3d" xmlns:o="urn:schemas-microsoft-com:office:office" xmlns:oel="http://schemas.microsoft.com/office/2019/extlst" xmlns:r="http://schemas.openxmlformats.org/officeDocument/2006/relationships" xmlns:m="http://schemas.openxmlformats.org/officeDocument/2006/math" xmlns:v="urn:schemas-microsoft-com:vml" xmlns:wp14="http://schemas.microsoft.com/office/word/2010/wordprocessingDrawing" xmlns:wp="http://schemas.openxmlformats.org/drawingml/2006/wordprocessingDrawing" xmlns:w10="urn:schemas-microsoft-com:office:word" xmlns:w="http://schemas.openxmlformats.org/wordprocessingml/2006/main" xmlns:w14="http://schemas.microsoft.com/office/word/2010/wordml" xmlns:w15="http://schemas.microsoft.com/office/word/2012/wordml" xmlns:w16cex="http://schemas.microsoft.com/office/word/2018/wordml/cex" xmlns:w16cid="http://schemas.microsoft.com/office/word/2016/wordml/cid" xmlns:w16="http://schemas.microsoft.com/office/word/2018/wordml" xmlns:w16du="http://schemas.microsoft.com/office/word/2023/wordml/word16du" xmlns:w16sdtdh="http://schemas.microsoft.com/office/word/2020/wordml/sdtdatahash" xmlns:w16sdtfl="http://schemas.microsoft.com/office/word/2024/wordml/sdtformatlock" xmlns:w16se="http://schemas.microsoft.com/office/word/2015/wordml/symex" xmlns:wpg="http://schemas.microsoft.com/office/word/2010/wordprocessingGroup" xmlns:wpi="http://schemas.microsoft.com/office/word/2010/wordprocessingInk" xmlns:wne="http://schemas.microsoft.com/office/word/2006/wordml" xmlns:wps="http://schemas.microsoft.com/office/word/2010/wordprocessingShape" mc:Ignorable="w14 w15 w16se w16cid w16 w16cex w16sdtdh w16sdtfl w16du wp14">
+<w:footnotes xmlns:wpc="http://schemas.microsoft.com/office/word/2010/wordprocessingCanvas" xmlns:cx="http://schemas.microsoft.com/office/drawing/2014/chartex" xmlns:cx1="http://schemas.microsoft.com/office/drawing/2015/9/8/chartex" xmlns:cx2="http://schemas.microsoft.com/office/drawing/2015/10/21/chartex" xmlns:cx3="http://schemas.microsoft.com/office/drawing/2016/5/9/chartex" xmlns:cx4="http://schemas.microsoft.com/office/drawing/2016/5/10/chartex" xmlns:cx5="http://schemas.microsoft.com/office/drawing/2016/5/11/chartex" xmlns:cx6="http://schemas.microsoft.com/office/drawing/2016/5/12/chartex" xmlns:cx7="http://schemas.microsoft.com/office/drawing/2016/5/13/chartex" xmlns:cx8="http://schemas.microsoft.com/office/drawing/2016/5/14/chartex" xmlns:mc="http://schemas.openxmlformats.org/markup-compatibility/2006" xmlns:m="http://schemas.openxmlformats.org/officeDocument/2006/math" xmlns:aink="http://schemas.microsoft.com/office/drawing/2016/ink" xmlns:am3d="http://schemas.microsoft.com/office/drawing/2017/model3d" xmlns:oel="http://schemas.microsoft.com/office/2019/extlst" xmlns:r="http://schemas.openxmlformats.org/officeDocument/2006/relationships" xmlns:wp14="http://schemas.microsoft.com/office/word/2010/wordprocessingDrawing" xmlns:wp="http://schemas.openxmlformats.org/drawingml/2006/wordprocessingDrawing" xmlns:wpg="http://schemas.microsoft.com/office/word/2010/wordprocessingGroup" xmlns:wpi="http://schemas.microsoft.com/office/word/2010/wordprocessingInk" xmlns:wps="http://schemas.microsoft.com/office/word/2010/wordprocessingShape" xmlns:o="urn:schemas-microsoft-com:office:office" xmlns:v="urn:schemas-microsoft-com:vml" xmlns:w10="urn:schemas-microsoft-com:office:word" xmlns:w="http://schemas.openxmlformats.org/wordprocessingml/2006/main" xmlns:w14="http://schemas.microsoft.com/office/word/2010/wordml" xmlns:w15="http://schemas.microsoft.com/office/word/2012/wordml" xmlns:w16cei="http://schemas.microsoft.com/office/word/2026/wordml/cei" xmlns:w16cex="http://schemas.microsoft.com/office/word/2018/wordml/cex" xmlns:w16cid="http://schemas.microsoft.com/office/word/2016/wordml/cid" xmlns:w16="http://schemas.microsoft.com/office/word/2018/wordml" xmlns:w16sdtdh="http://schemas.microsoft.com/office/word/2020/wordml/sdtdatahash" xmlns:w16sdtfl="http://schemas.microsoft.com/office/word/2024/wordml/sdtformatlock" xmlns:w16se="http://schemas.microsoft.com/office/word/2015/wordml/symex" xmlns:w16du="http://schemas.microsoft.com/office/word/2023/wordml/word16du" xmlns:wne="http://schemas.microsoft.com/office/word/2006/wordml" mc:Ignorable="w14 w15 w16se w16cid w16 w16cex w16sdtdh w16sdtfl w16du wp14">
   <w:footnote w:type="separator" w:id="-1">
     <w:p>
       <w:pPr>
@@ -5406,7 +7571,7 @@
 </file>
 
 <file path=word/header1.xml><?xml version="1.0" encoding="utf-8"?>
-<w:hdr xmlns:wpc="http://schemas.microsoft.com/office/word/2010/wordprocessingCanvas" xmlns:cx="http://schemas.microsoft.com/office/drawing/2014/chartex" xmlns:cx1="http://schemas.microsoft.com/office/drawing/2015/9/8/chartex" xmlns:cx2="http://schemas.microsoft.com/office/drawing/2015/10/21/chartex" xmlns:cx3="http://schemas.microsoft.com/office/drawing/2016/5/9/chartex" xmlns:cx4="http://schemas.microsoft.com/office/drawing/2016/5/10/chartex" xmlns:cx5="http://schemas.microsoft.com/office/drawing/2016/5/11/chartex" xmlns:cx6="http://schemas.microsoft.com/office/drawing/2016/5/12/chartex" xmlns:cx7="http://schemas.microsoft.com/office/drawing/2016/5/13/chartex" xmlns:cx8="http://schemas.microsoft.com/office/drawing/2016/5/14/chartex" xmlns:mc="http://schemas.openxmlformats.org/markup-compatibility/2006" xmlns:aink="http://schemas.microsoft.com/office/drawing/2016/ink" xmlns:am3d="http://schemas.microsoft.com/office/drawing/2017/model3d" xmlns:o="urn:schemas-microsoft-com:office:office" xmlns:oel="http://schemas.microsoft.com/office/2019/extlst" xmlns:r="http://schemas.openxmlformats.org/officeDocument/2006/relationships" xmlns:m="http://schemas.openxmlformats.org/officeDocument/2006/math" xmlns:v="urn:schemas-microsoft-com:vml" xmlns:wp14="http://schemas.microsoft.com/office/word/2010/wordprocessingDrawing" xmlns:wp="http://schemas.openxmlformats.org/drawingml/2006/wordprocessingDrawing" xmlns:w10="urn:schemas-microsoft-com:office:word" xmlns:w="http://schemas.openxmlformats.org/wordprocessingml/2006/main" xmlns:w14="http://schemas.microsoft.com/office/word/2010/wordml" xmlns:w15="http://schemas.microsoft.com/office/word/2012/wordml" xmlns:w16cex="http://schemas.microsoft.com/office/word/2018/wordml/cex" xmlns:w16cid="http://schemas.microsoft.com/office/word/2016/wordml/cid" xmlns:w16="http://schemas.microsoft.com/office/word/2018/wordml" xmlns:w16du="http://schemas.microsoft.com/office/word/2023/wordml/word16du" xmlns:w16sdtdh="http://schemas.microsoft.com/office/word/2020/wordml/sdtdatahash" xmlns:w16sdtfl="http://schemas.microsoft.com/office/word/2024/wordml/sdtformatlock" xmlns:w16se="http://schemas.microsoft.com/office/word/2015/wordml/symex" xmlns:wpg="http://schemas.microsoft.com/office/word/2010/wordprocessingGroup" xmlns:wpi="http://schemas.microsoft.com/office/word/2010/wordprocessingInk" xmlns:wne="http://schemas.microsoft.com/office/word/2006/wordml" xmlns:wps="http://schemas.microsoft.com/office/word/2010/wordprocessingShape" mc:Ignorable="w14 w15 w16se w16cid w16 w16cex w16sdtdh w16sdtfl w16du wp14">
+<w:hdr xmlns:wpc="http://schemas.microsoft.com/office/word/2010/wordprocessingCanvas" xmlns:cx="http://schemas.microsoft.com/office/drawing/2014/chartex" xmlns:cx1="http://schemas.microsoft.com/office/drawing/2015/9/8/chartex" xmlns:cx2="http://schemas.microsoft.com/office/drawing/2015/10/21/chartex" xmlns:cx3="http://schemas.microsoft.com/office/drawing/2016/5/9/chartex" xmlns:cx4="http://schemas.microsoft.com/office/drawing/2016/5/10/chartex" xmlns:cx5="http://schemas.microsoft.com/office/drawing/2016/5/11/chartex" xmlns:cx6="http://schemas.microsoft.com/office/drawing/2016/5/12/chartex" xmlns:cx7="http://schemas.microsoft.com/office/drawing/2016/5/13/chartex" xmlns:cx8="http://schemas.microsoft.com/office/drawing/2016/5/14/chartex" xmlns:mc="http://schemas.openxmlformats.org/markup-compatibility/2006" xmlns:m="http://schemas.openxmlformats.org/officeDocument/2006/math" xmlns:aink="http://schemas.microsoft.com/office/drawing/2016/ink" xmlns:am3d="http://schemas.microsoft.com/office/drawing/2017/model3d" xmlns:oel="http://schemas.microsoft.com/office/2019/extlst" xmlns:r="http://schemas.openxmlformats.org/officeDocument/2006/relationships" xmlns:wp14="http://schemas.microsoft.com/office/word/2010/wordprocessingDrawing" xmlns:wp="http://schemas.openxmlformats.org/drawingml/2006/wordprocessingDrawing" xmlns:wpg="http://schemas.microsoft.com/office/word/2010/wordprocessingGroup" xmlns:wpi="http://schemas.microsoft.com/office/word/2010/wordprocessingInk" xmlns:wps="http://schemas.microsoft.com/office/word/2010/wordprocessingShape" xmlns:o="urn:schemas-microsoft-com:office:office" xmlns:v="urn:schemas-microsoft-com:vml" xmlns:w10="urn:schemas-microsoft-com:office:word" xmlns:w="http://schemas.openxmlformats.org/wordprocessingml/2006/main" xmlns:w14="http://schemas.microsoft.com/office/word/2010/wordml" xmlns:w15="http://schemas.microsoft.com/office/word/2012/wordml" xmlns:w16cei="http://schemas.microsoft.com/office/word/2026/wordml/cei" xmlns:w16cex="http://schemas.microsoft.com/office/word/2018/wordml/cex" xmlns:w16cid="http://schemas.microsoft.com/office/word/2016/wordml/cid" xmlns:w16="http://schemas.microsoft.com/office/word/2018/wordml" xmlns:w16sdtdh="http://schemas.microsoft.com/office/word/2020/wordml/sdtdatahash" xmlns:w16sdtfl="http://schemas.microsoft.com/office/word/2024/wordml/sdtformatlock" xmlns:w16se="http://schemas.microsoft.com/office/word/2015/wordml/symex" xmlns:w16du="http://schemas.microsoft.com/office/word/2023/wordml/word16du" xmlns:wne="http://schemas.microsoft.com/office/word/2006/wordml" mc:Ignorable="w14 w15 w16se w16cid w16 w16cex w16sdtdh w16sdtfl w16du wp14">
   <w:p>
     <w:pPr>
       <w:pStyle w:val="Header"/>
@@ -5441,7 +7606,7 @@
 </file>
 
 <file path=word/header2.xml><?xml version="1.0" encoding="utf-8"?>
-<w:hdr xmlns:wpc="http://schemas.microsoft.com/office/word/2010/wordprocessingCanvas" xmlns:cx="http://schemas.microsoft.com/office/drawing/2014/chartex" xmlns:cx1="http://schemas.microsoft.com/office/drawing/2015/9/8/chartex" xmlns:cx2="http://schemas.microsoft.com/office/drawing/2015/10/21/chartex" xmlns:cx3="http://schemas.microsoft.com/office/drawing/2016/5/9/chartex" xmlns:cx4="http://schemas.microsoft.com/office/drawing/2016/5/10/chartex" xmlns:cx5="http://schemas.microsoft.com/office/drawing/2016/5/11/chartex" xmlns:cx6="http://schemas.microsoft.com/office/drawing/2016/5/12/chartex" xmlns:cx7="http://schemas.microsoft.com/office/drawing/2016/5/13/chartex" xmlns:cx8="http://schemas.microsoft.com/office/drawing/2016/5/14/chartex" xmlns:mc="http://schemas.openxmlformats.org/markup-compatibility/2006" xmlns:aink="http://schemas.microsoft.com/office/drawing/2016/ink" xmlns:am3d="http://schemas.microsoft.com/office/drawing/2017/model3d" xmlns:o="urn:schemas-microsoft-com:office:office" xmlns:oel="http://schemas.microsoft.com/office/2019/extlst" xmlns:r="http://schemas.openxmlformats.org/officeDocument/2006/relationships" xmlns:m="http://schemas.openxmlformats.org/officeDocument/2006/math" xmlns:v="urn:schemas-microsoft-com:vml" xmlns:wp14="http://schemas.microsoft.com/office/word/2010/wordprocessingDrawing" xmlns:wp="http://schemas.openxmlformats.org/drawingml/2006/wordprocessingDrawing" xmlns:w10="urn:schemas-microsoft-com:office:word" xmlns:w="http://schemas.openxmlformats.org/wordprocessingml/2006/main" xmlns:w14="http://schemas.microsoft.com/office/word/2010/wordml" xmlns:w15="http://schemas.microsoft.com/office/word/2012/wordml" xmlns:w16cex="http://schemas.microsoft.com/office/word/2018/wordml/cex" xmlns:w16cid="http://schemas.microsoft.com/office/word/2016/wordml/cid" xmlns:w16="http://schemas.microsoft.com/office/word/2018/wordml" xmlns:w16du="http://schemas.microsoft.com/office/word/2023/wordml/word16du" xmlns:w16sdtdh="http://schemas.microsoft.com/office/word/2020/wordml/sdtdatahash" xmlns:w16sdtfl="http://schemas.microsoft.com/office/word/2024/wordml/sdtformatlock" xmlns:w16se="http://schemas.microsoft.com/office/word/2015/wordml/symex" xmlns:wpg="http://schemas.microsoft.com/office/word/2010/wordprocessingGroup" xmlns:wpi="http://schemas.microsoft.com/office/word/2010/wordprocessingInk" xmlns:wne="http://schemas.microsoft.com/office/word/2006/wordml" xmlns:wps="http://schemas.microsoft.com/office/word/2010/wordprocessingShape" mc:Ignorable="w14 w15 w16se w16cid w16 w16cex w16sdtdh w16sdtfl w16du wp14">
+<w:hdr xmlns:wpc="http://schemas.microsoft.com/office/word/2010/wordprocessingCanvas" xmlns:cx="http://schemas.microsoft.com/office/drawing/2014/chartex" xmlns:cx1="http://schemas.microsoft.com/office/drawing/2015/9/8/chartex" xmlns:cx2="http://schemas.microsoft.com/office/drawing/2015/10/21/chartex" xmlns:cx3="http://schemas.microsoft.com/office/drawing/2016/5/9/chartex" xmlns:cx4="http://schemas.microsoft.com/office/drawing/2016/5/10/chartex" xmlns:cx5="http://schemas.microsoft.com/office/drawing/2016/5/11/chartex" xmlns:cx6="http://schemas.microsoft.com/office/drawing/2016/5/12/chartex" xmlns:cx7="http://schemas.microsoft.com/office/drawing/2016/5/13/chartex" xmlns:cx8="http://schemas.microsoft.com/office/drawing/2016/5/14/chartex" xmlns:mc="http://schemas.openxmlformats.org/markup-compatibility/2006" xmlns:m="http://schemas.openxmlformats.org/officeDocument/2006/math" xmlns:aink="http://schemas.microsoft.com/office/drawing/2016/ink" xmlns:am3d="http://schemas.microsoft.com/office/drawing/2017/model3d" xmlns:oel="http://schemas.microsoft.com/office/2019/extlst" xmlns:r="http://schemas.openxmlformats.org/officeDocument/2006/relationships" xmlns:wp14="http://schemas.microsoft.com/office/word/2010/wordprocessingDrawing" xmlns:wp="http://schemas.openxmlformats.org/drawingml/2006/wordprocessingDrawing" xmlns:wpg="http://schemas.microsoft.com/office/word/2010/wordprocessingGroup" xmlns:wpi="http://schemas.microsoft.com/office/word/2010/wordprocessingInk" xmlns:wps="http://schemas.microsoft.com/office/word/2010/wordprocessingShape" xmlns:o="urn:schemas-microsoft-com:office:office" xmlns:v="urn:schemas-microsoft-com:vml" xmlns:w10="urn:schemas-microsoft-com:office:word" xmlns:w="http://schemas.openxmlformats.org/wordprocessingml/2006/main" xmlns:w14="http://schemas.microsoft.com/office/word/2010/wordml" xmlns:w15="http://schemas.microsoft.com/office/word/2012/wordml" xmlns:w16cei="http://schemas.microsoft.com/office/word/2026/wordml/cei" xmlns:w16cex="http://schemas.microsoft.com/office/word/2018/wordml/cex" xmlns:w16cid="http://schemas.microsoft.com/office/word/2016/wordml/cid" xmlns:w16="http://schemas.microsoft.com/office/word/2018/wordml" xmlns:w16sdtdh="http://schemas.microsoft.com/office/word/2020/wordml/sdtdatahash" xmlns:w16sdtfl="http://schemas.microsoft.com/office/word/2024/wordml/sdtformatlock" xmlns:w16se="http://schemas.microsoft.com/office/word/2015/wordml/symex" xmlns:w16du="http://schemas.microsoft.com/office/word/2023/wordml/word16du" xmlns:wne="http://schemas.microsoft.com/office/word/2006/wordml" mc:Ignorable="w14 w15 w16se w16cid w16 w16cex w16sdtdh w16sdtfl w16du wp14">
   <w:p>
     <w:pPr>
       <w:pStyle w:val="Header"/>
@@ -5476,7 +7641,7 @@
 </file>
 
 <file path=word/header3.xml><?xml version="1.0" encoding="utf-8"?>
-<w:hdr xmlns:wpc="http://schemas.microsoft.com/office/word/2010/wordprocessingCanvas" xmlns:cx="http://schemas.microsoft.com/office/drawing/2014/chartex" xmlns:cx1="http://schemas.microsoft.com/office/drawing/2015/9/8/chartex" xmlns:cx2="http://schemas.microsoft.com/office/drawing/2015/10/21/chartex" xmlns:cx3="http://schemas.microsoft.com/office/drawing/2016/5/9/chartex" xmlns:cx4="http://schemas.microsoft.com/office/drawing/2016/5/10/chartex" xmlns:cx5="http://schemas.microsoft.com/office/drawing/2016/5/11/chartex" xmlns:cx6="http://schemas.microsoft.com/office/drawing/2016/5/12/chartex" xmlns:cx7="http://schemas.microsoft.com/office/drawing/2016/5/13/chartex" xmlns:cx8="http://schemas.microsoft.com/office/drawing/2016/5/14/chartex" xmlns:mc="http://schemas.openxmlformats.org/markup-compatibility/2006" xmlns:aink="http://schemas.microsoft.com/office/drawing/2016/ink" xmlns:am3d="http://schemas.microsoft.com/office/drawing/2017/model3d" xmlns:o="urn:schemas-microsoft-com:office:office" xmlns:oel="http://schemas.microsoft.com/office/2019/extlst" xmlns:r="http://schemas.openxmlformats.org/officeDocument/2006/relationships" xmlns:m="http://schemas.openxmlformats.org/officeDocument/2006/math" xmlns:v="urn:schemas-microsoft-com:vml" xmlns:wp14="http://schemas.microsoft.com/office/word/2010/wordprocessingDrawing" xmlns:wp="http://schemas.openxmlformats.org/drawingml/2006/wordprocessingDrawing" xmlns:w10="urn:schemas-microsoft-com:office:word" xmlns:w="http://schemas.openxmlformats.org/wordprocessingml/2006/main" xmlns:w14="http://schemas.microsoft.com/office/word/2010/wordml" xmlns:w15="http://schemas.microsoft.com/office/word/2012/wordml" xmlns:w16cex="http://schemas.microsoft.com/office/word/2018/wordml/cex" xmlns:w16cid="http://schemas.microsoft.com/office/word/2016/wordml/cid" xmlns:w16="http://schemas.microsoft.com/office/word/2018/wordml" xmlns:w16du="http://schemas.microsoft.com/office/word/2023/wordml/word16du" xmlns:w16sdtdh="http://schemas.microsoft.com/office/word/2020/wordml/sdtdatahash" xmlns:w16sdtfl="http://schemas.microsoft.com/office/word/2024/wordml/sdtformatlock" xmlns:w16se="http://schemas.microsoft.com/office/word/2015/wordml/symex" xmlns:wpg="http://schemas.microsoft.com/office/word/2010/wordprocessingGroup" xmlns:wpi="http://schemas.microsoft.com/office/word/2010/wordprocessingInk" xmlns:wne="http://schemas.microsoft.com/office/word/2006/wordml" xmlns:wps="http://schemas.microsoft.com/office/word/2010/wordprocessingShape" mc:Ignorable="w14 w15 w16se w16cid w16 w16cex w16sdtdh w16sdtfl w16du wp14">
+<w:hdr xmlns:wpc="http://schemas.microsoft.com/office/word/2010/wordprocessingCanvas" xmlns:cx="http://schemas.microsoft.com/office/drawing/2014/chartex" xmlns:cx1="http://schemas.microsoft.com/office/drawing/2015/9/8/chartex" xmlns:cx2="http://schemas.microsoft.com/office/drawing/2015/10/21/chartex" xmlns:cx3="http://schemas.microsoft.com/office/drawing/2016/5/9/chartex" xmlns:cx4="http://schemas.microsoft.com/office/drawing/2016/5/10/chartex" xmlns:cx5="http://schemas.microsoft.com/office/drawing/2016/5/11/chartex" xmlns:cx6="http://schemas.microsoft.com/office/drawing/2016/5/12/chartex" xmlns:cx7="http://schemas.microsoft.com/office/drawing/2016/5/13/chartex" xmlns:cx8="http://schemas.microsoft.com/office/drawing/2016/5/14/chartex" xmlns:mc="http://schemas.openxmlformats.org/markup-compatibility/2006" xmlns:m="http://schemas.openxmlformats.org/officeDocument/2006/math" xmlns:aink="http://schemas.microsoft.com/office/drawing/2016/ink" xmlns:am3d="http://schemas.microsoft.com/office/drawing/2017/model3d" xmlns:oel="http://schemas.microsoft.com/office/2019/extlst" xmlns:r="http://schemas.openxmlformats.org/officeDocument/2006/relationships" xmlns:wp14="http://schemas.microsoft.com/office/word/2010/wordprocessingDrawing" xmlns:wp="http://schemas.openxmlformats.org/drawingml/2006/wordprocessingDrawing" xmlns:wpg="http://schemas.microsoft.com/office/word/2010/wordprocessingGroup" xmlns:wpi="http://schemas.microsoft.com/office/word/2010/wordprocessingInk" xmlns:wps="http://schemas.microsoft.com/office/word/2010/wordprocessingShape" xmlns:o="urn:schemas-microsoft-com:office:office" xmlns:v="urn:schemas-microsoft-com:vml" xmlns:w10="urn:schemas-microsoft-com:office:word" xmlns:w="http://schemas.openxmlformats.org/wordprocessingml/2006/main" xmlns:w14="http://schemas.microsoft.com/office/word/2010/wordml" xmlns:w15="http://schemas.microsoft.com/office/word/2012/wordml" xmlns:w16cei="http://schemas.microsoft.com/office/word/2026/wordml/cei" xmlns:w16cex="http://schemas.microsoft.com/office/word/2018/wordml/cex" xmlns:w16cid="http://schemas.microsoft.com/office/word/2016/wordml/cid" xmlns:w16="http://schemas.microsoft.com/office/word/2018/wordml" xmlns:w16sdtdh="http://schemas.microsoft.com/office/word/2020/wordml/sdtdatahash" xmlns:w16sdtfl="http://schemas.microsoft.com/office/word/2024/wordml/sdtformatlock" xmlns:w16se="http://schemas.microsoft.com/office/word/2015/wordml/symex" xmlns:w16du="http://schemas.microsoft.com/office/word/2023/wordml/word16du" xmlns:wne="http://schemas.microsoft.com/office/word/2006/wordml" mc:Ignorable="w14 w15 w16se w16cid w16 w16cex w16sdtdh w16sdtfl w16du wp14">
   <w:p>
     <w:pPr>
       <w:pStyle w:val="Header"/>
@@ -5511,7 +7676,7 @@
 </file>
 
 <file path=word/numbering.xml><?xml version="1.0" encoding="utf-8"?>
-<w:numbering xmlns:wpc="http://schemas.microsoft.com/office/word/2010/wordprocessingCanvas" xmlns:cx="http://schemas.microsoft.com/office/drawing/2014/chartex" xmlns:cx1="http://schemas.microsoft.com/office/drawing/2015/9/8/chartex" xmlns:cx2="http://schemas.microsoft.com/office/drawing/2015/10/21/chartex" xmlns:cx3="http://schemas.microsoft.com/office/drawing/2016/5/9/chartex" xmlns:cx4="http://schemas.microsoft.com/office/drawing/2016/5/10/chartex" xmlns:cx5="http://schemas.microsoft.com/office/drawing/2016/5/11/chartex" xmlns:cx6="http://schemas.microsoft.com/office/drawing/2016/5/12/chartex" xmlns:cx7="http://schemas.microsoft.com/office/drawing/2016/5/13/chartex" xmlns:cx8="http://schemas.microsoft.com/office/drawing/2016/5/14/chartex" xmlns:mc="http://schemas.openxmlformats.org/markup-compatibility/2006" xmlns:aink="http://schemas.microsoft.com/office/drawing/2016/ink" xmlns:am3d="http://schemas.microsoft.com/office/drawing/2017/model3d" xmlns:o="urn:schemas-microsoft-com:office:office" xmlns:oel="http://schemas.microsoft.com/office/2019/extlst" xmlns:r="http://schemas.openxmlformats.org/officeDocument/2006/relationships" xmlns:m="http://schemas.openxmlformats.org/officeDocument/2006/math" xmlns:v="urn:schemas-microsoft-com:vml" xmlns:wp14="http://schemas.microsoft.com/office/word/2010/wordprocessingDrawing" xmlns:wp="http://schemas.openxmlformats.org/drawingml/2006/wordprocessingDrawing" xmlns:w10="urn:schemas-microsoft-com:office:word" xmlns:w="http://schemas.openxmlformats.org/wordprocessingml/2006/main" xmlns:w14="http://schemas.microsoft.com/office/word/2010/wordml" xmlns:w15="http://schemas.microsoft.com/office/word/2012/wordml" xmlns:w16cex="http://schemas.microsoft.com/office/word/2018/wordml/cex" xmlns:w16cid="http://schemas.microsoft.com/office/word/2016/wordml/cid" xmlns:w16="http://schemas.microsoft.com/office/word/2018/wordml" xmlns:w16du="http://schemas.microsoft.com/office/word/2023/wordml/word16du" xmlns:w16sdtdh="http://schemas.microsoft.com/office/word/2020/wordml/sdtdatahash" xmlns:w16sdtfl="http://schemas.microsoft.com/office/word/2024/wordml/sdtformatlock" xmlns:w16se="http://schemas.microsoft.com/office/word/2015/wordml/symex" xmlns:wpg="http://schemas.microsoft.com/office/word/2010/wordprocessingGroup" xmlns:wpi="http://schemas.microsoft.com/office/word/2010/wordprocessingInk" xmlns:wne="http://schemas.microsoft.com/office/word/2006/wordml" xmlns:wps="http://schemas.microsoft.com/office/word/2010/wordprocessingShape" mc:Ignorable="w14 w15 w16se w16cid w16 w16cex w16sdtdh w16sdtfl w16du wp14">
+<w:numbering xmlns:wpc="http://schemas.microsoft.com/office/word/2010/wordprocessingCanvas" xmlns:cx="http://schemas.microsoft.com/office/drawing/2014/chartex" xmlns:cx1="http://schemas.microsoft.com/office/drawing/2015/9/8/chartex" xmlns:cx2="http://schemas.microsoft.com/office/drawing/2015/10/21/chartex" xmlns:cx3="http://schemas.microsoft.com/office/drawing/2016/5/9/chartex" xmlns:cx4="http://schemas.microsoft.com/office/drawing/2016/5/10/chartex" xmlns:cx5="http://schemas.microsoft.com/office/drawing/2016/5/11/chartex" xmlns:cx6="http://schemas.microsoft.com/office/drawing/2016/5/12/chartex" xmlns:cx7="http://schemas.microsoft.com/office/drawing/2016/5/13/chartex" xmlns:cx8="http://schemas.microsoft.com/office/drawing/2016/5/14/chartex" xmlns:mc="http://schemas.openxmlformats.org/markup-compatibility/2006" xmlns:m="http://schemas.openxmlformats.org/officeDocument/2006/math" xmlns:aink="http://schemas.microsoft.com/office/drawing/2016/ink" xmlns:am3d="http://schemas.microsoft.com/office/drawing/2017/model3d" xmlns:oel="http://schemas.microsoft.com/office/2019/extlst" xmlns:r="http://schemas.openxmlformats.org/officeDocument/2006/relationships" xmlns:wp14="http://schemas.microsoft.com/office/word/2010/wordprocessingDrawing" xmlns:wp="http://schemas.openxmlformats.org/drawingml/2006/wordprocessingDrawing" xmlns:wpg="http://schemas.microsoft.com/office/word/2010/wordprocessingGroup" xmlns:wpi="http://schemas.microsoft.com/office/word/2010/wordprocessingInk" xmlns:wps="http://schemas.microsoft.com/office/word/2010/wordprocessingShape" xmlns:o="urn:schemas-microsoft-com:office:office" xmlns:v="urn:schemas-microsoft-com:vml" xmlns:w10="urn:schemas-microsoft-com:office:word" xmlns:w="http://schemas.openxmlformats.org/wordprocessingml/2006/main" xmlns:w14="http://schemas.microsoft.com/office/word/2010/wordml" xmlns:w15="http://schemas.microsoft.com/office/word/2012/wordml" xmlns:w16cei="http://schemas.microsoft.com/office/word/2026/wordml/cei" xmlns:w16cex="http://schemas.microsoft.com/office/word/2018/wordml/cex" xmlns:w16cid="http://schemas.microsoft.com/office/word/2016/wordml/cid" xmlns:w16="http://schemas.microsoft.com/office/word/2018/wordml" xmlns:w16sdtdh="http://schemas.microsoft.com/office/word/2020/wordml/sdtdatahash" xmlns:w16sdtfl="http://schemas.microsoft.com/office/word/2024/wordml/sdtformatlock" xmlns:w16se="http://schemas.microsoft.com/office/word/2015/wordml/symex" xmlns:w16du="http://schemas.microsoft.com/office/word/2023/wordml/word16du" xmlns:wne="http://schemas.microsoft.com/office/word/2006/wordml" mc:Ignorable="w14 w15 w16se w16cid w16 w16cex w16sdtdh w16sdtfl w16du wp14">
   <w:abstractNum w:abstractNumId="0" w15:restartNumberingAfterBreak="0">
     <w:nsid w:val="FFFFFF7C"/>
     <w:multiLevelType w:val="singleLevel"/>
@@ -5714,7 +7879,7 @@
 </file>
 
 <file path=word/styles.xml><?xml version="1.0" encoding="utf-8"?>
-<w:styles xmlns:mc="http://schemas.openxmlformats.org/markup-compatibility/2006" xmlns:r="http://schemas.openxmlformats.org/officeDocument/2006/relationships" xmlns:w="http://schemas.openxmlformats.org/wordprocessingml/2006/main" xmlns:w14="http://schemas.microsoft.com/office/word/2010/wordml" xmlns:w15="http://schemas.microsoft.com/office/word/2012/wordml" xmlns:w16cex="http://schemas.microsoft.com/office/word/2018/wordml/cex" xmlns:w16cid="http://schemas.microsoft.com/office/word/2016/wordml/cid" xmlns:w16="http://schemas.microsoft.com/office/word/2018/wordml" xmlns:w16du="http://schemas.microsoft.com/office/word/2023/wordml/word16du" xmlns:w16sdtdh="http://schemas.microsoft.com/office/word/2020/wordml/sdtdatahash" xmlns:w16sdtfl="http://schemas.microsoft.com/office/word/2024/wordml/sdtformatlock" xmlns:w16se="http://schemas.microsoft.com/office/word/2015/wordml/symex" mc:Ignorable="w14 w15 w16se w16cid w16 w16cex w16sdtdh w16sdtfl w16du">
+<w:styles xmlns:mc="http://schemas.openxmlformats.org/markup-compatibility/2006" xmlns:r="http://schemas.openxmlformats.org/officeDocument/2006/relationships" xmlns:w="http://schemas.openxmlformats.org/wordprocessingml/2006/main" xmlns:w14="http://schemas.microsoft.com/office/word/2010/wordml" xmlns:w15="http://schemas.microsoft.com/office/word/2012/wordml" xmlns:w16cex="http://schemas.microsoft.com/office/word/2018/wordml/cex" xmlns:w16cid="http://schemas.microsoft.com/office/word/2016/wordml/cid" xmlns:w16="http://schemas.microsoft.com/office/word/2018/wordml" xmlns:w16sdtdh="http://schemas.microsoft.com/office/word/2020/wordml/sdtdatahash" xmlns:w16sdtfl="http://schemas.microsoft.com/office/word/2024/wordml/sdtformatlock" xmlns:w16se="http://schemas.microsoft.com/office/word/2015/wordml/symex" xmlns:w16du="http://schemas.microsoft.com/office/word/2023/wordml/word16du" mc:Ignorable="w14 w15 w16se w16cid w16 w16cex w16sdtdh w16sdtfl w16du">
   <w:docDefaults>
     <w:rPrDefault>
       <w:rPr>
@@ -15234,7 +17399,7 @@
       </w:tcPr>
     </w:tblStylePr>
   </w:style>
-  <w:style w:type="table" w:styleId="ColorfulShading">
+  <w:style w:type="table" w:styleId="ColourfulShading">
     <w:name w:val="Colorful Shading"/>
     <w:basedOn w:val="TableNormal"/>
     <w:uiPriority w:val="71"/>
@@ -15349,7 +17514,7 @@
       </w:rPr>
     </w:tblStylePr>
   </w:style>
-  <w:style w:type="table" w:styleId="ColorfulShading-Accent1">
+  <w:style w:type="table" w:styleId="ColourfulShadingAccent1">
     <w:name w:val="Colorful Shading Accent 1"/>
     <w:basedOn w:val="TableNormal"/>
     <w:uiPriority w:val="71"/>
@@ -15464,7 +17629,7 @@
       </w:rPr>
     </w:tblStylePr>
   </w:style>
-  <w:style w:type="table" w:styleId="ColorfulShading-Accent2">
+  <w:style w:type="table" w:styleId="ColourfulShadingAccent2">
     <w:name w:val="Colorful Shading Accent 2"/>
     <w:basedOn w:val="TableNormal"/>
     <w:uiPriority w:val="71"/>
@@ -15579,7 +17744,7 @@
       </w:rPr>
     </w:tblStylePr>
   </w:style>
-  <w:style w:type="table" w:styleId="ColorfulShading-Accent3">
+  <w:style w:type="table" w:styleId="ColourfulShadingAccent3">
     <w:name w:val="Colorful Shading Accent 3"/>
     <w:basedOn w:val="TableNormal"/>
     <w:uiPriority w:val="71"/>
@@ -15684,7 +17849,7 @@
       </w:tcPr>
     </w:tblStylePr>
   </w:style>
-  <w:style w:type="table" w:styleId="ColorfulShading-Accent4">
+  <w:style w:type="table" w:styleId="ColourfulShadingAccent4">
     <w:name w:val="Colorful Shading Accent 4"/>
     <w:basedOn w:val="TableNormal"/>
     <w:uiPriority w:val="71"/>
@@ -15799,7 +17964,7 @@
       </w:rPr>
     </w:tblStylePr>
   </w:style>
-  <w:style w:type="table" w:styleId="ColorfulShading-Accent5">
+  <w:style w:type="table" w:styleId="ColourfulShadingAccent5">
     <w:name w:val="Colorful Shading Accent 5"/>
     <w:basedOn w:val="TableNormal"/>
     <w:uiPriority w:val="71"/>
@@ -15914,7 +18079,7 @@
       </w:rPr>
     </w:tblStylePr>
   </w:style>
-  <w:style w:type="table" w:styleId="ColorfulShading-Accent6">
+  <w:style w:type="table" w:styleId="ColourfulShadingAccent6">
     <w:name w:val="Colorful Shading Accent 6"/>
     <w:basedOn w:val="TableNormal"/>
     <w:uiPriority w:val="71"/>
@@ -16029,7 +18194,7 @@
       </w:rPr>
     </w:tblStylePr>
   </w:style>
-  <w:style w:type="table" w:styleId="ColorfulList">
+  <w:style w:type="table" w:styleId="ColourfulList">
     <w:name w:val="Colorful List"/>
     <w:basedOn w:val="TableNormal"/>
     <w:uiPriority w:val="72"/>
@@ -16108,7 +18273,7 @@
       </w:tcPr>
     </w:tblStylePr>
   </w:style>
-  <w:style w:type="table" w:styleId="ColorfulList-Accent1">
+  <w:style w:type="table" w:styleId="ColourfulListAccent1">
     <w:name w:val="Colorful List Accent 1"/>
     <w:basedOn w:val="TableNormal"/>
     <w:uiPriority w:val="72"/>
@@ -16187,7 +18352,7 @@
       </w:tcPr>
     </w:tblStylePr>
   </w:style>
-  <w:style w:type="table" w:styleId="ColorfulList-Accent2">
+  <w:style w:type="table" w:styleId="ColourfulListAccent2">
     <w:name w:val="Colorful List Accent 2"/>
     <w:basedOn w:val="TableNormal"/>
     <w:uiPriority w:val="72"/>
@@ -16266,7 +18431,7 @@
       </w:tcPr>
     </w:tblStylePr>
   </w:style>
-  <w:style w:type="table" w:styleId="ColorfulList-Accent3">
+  <w:style w:type="table" w:styleId="ColourfulListAccent3">
     <w:name w:val="Colorful List Accent 3"/>
     <w:basedOn w:val="TableNormal"/>
     <w:uiPriority w:val="72"/>
@@ -16345,7 +18510,7 @@
       </w:tcPr>
     </w:tblStylePr>
   </w:style>
-  <w:style w:type="table" w:styleId="ColorfulList-Accent4">
+  <w:style w:type="table" w:styleId="ColourfulListAccent4">
     <w:name w:val="Colorful List Accent 4"/>
     <w:basedOn w:val="TableNormal"/>
     <w:uiPriority w:val="72"/>
@@ -16424,7 +18589,7 @@
       </w:tcPr>
     </w:tblStylePr>
   </w:style>
-  <w:style w:type="table" w:styleId="ColorfulList-Accent5">
+  <w:style w:type="table" w:styleId="ColourfulListAccent5">
     <w:name w:val="Colorful List Accent 5"/>
     <w:basedOn w:val="TableNormal"/>
     <w:uiPriority w:val="72"/>
@@ -16503,7 +18668,7 @@
       </w:tcPr>
     </w:tblStylePr>
   </w:style>
-  <w:style w:type="table" w:styleId="ColorfulList-Accent6">
+  <w:style w:type="table" w:styleId="ColourfulListAccent6">
     <w:name w:val="Colorful List Accent 6"/>
     <w:basedOn w:val="TableNormal"/>
     <w:uiPriority w:val="72"/>
@@ -16582,7 +18747,7 @@
       </w:tcPr>
     </w:tblStylePr>
   </w:style>
-  <w:style w:type="table" w:styleId="ColorfulGrid">
+  <w:style w:type="table" w:styleId="ColourfulGrid">
     <w:name w:val="Colorful Grid"/>
     <w:basedOn w:val="TableNormal"/>
     <w:uiPriority w:val="73"/>
@@ -16655,7 +18820,7 @@
       </w:tcPr>
     </w:tblStylePr>
   </w:style>
-  <w:style w:type="table" w:styleId="ColorfulGrid-Accent1">
+  <w:style w:type="table" w:styleId="ColourfulGridAccent1">
     <w:name w:val="Colorful Grid Accent 1"/>
     <w:basedOn w:val="TableNormal"/>
     <w:uiPriority w:val="73"/>
@@ -16728,7 +18893,7 @@
       </w:tcPr>
     </w:tblStylePr>
   </w:style>
-  <w:style w:type="table" w:styleId="ColorfulGrid-Accent2">
+  <w:style w:type="table" w:styleId="ColourfulGridAccent2">
     <w:name w:val="Colorful Grid Accent 2"/>
     <w:basedOn w:val="TableNormal"/>
     <w:uiPriority w:val="73"/>
@@ -16801,7 +18966,7 @@
       </w:tcPr>
     </w:tblStylePr>
   </w:style>
-  <w:style w:type="table" w:styleId="ColorfulGrid-Accent3">
+  <w:style w:type="table" w:styleId="ColourfulGridAccent3">
     <w:name w:val="Colorful Grid Accent 3"/>
     <w:basedOn w:val="TableNormal"/>
     <w:uiPriority w:val="73"/>
@@ -16874,7 +19039,7 @@
       </w:tcPr>
     </w:tblStylePr>
   </w:style>
-  <w:style w:type="table" w:styleId="ColorfulGrid-Accent4">
+  <w:style w:type="table" w:styleId="ColourfulGridAccent4">
     <w:name w:val="Colorful Grid Accent 4"/>
     <w:basedOn w:val="TableNormal"/>
     <w:uiPriority w:val="73"/>
@@ -16947,7 +19112,7 @@
       </w:tcPr>
     </w:tblStylePr>
   </w:style>
-  <w:style w:type="table" w:styleId="ColorfulGrid-Accent5">
+  <w:style w:type="table" w:styleId="ColourfulGridAccent5">
     <w:name w:val="Colorful Grid Accent 5"/>
     <w:basedOn w:val="TableNormal"/>
     <w:uiPriority w:val="73"/>
@@ -17020,7 +19185,7 @@
       </w:tcPr>
     </w:tblStylePr>
   </w:style>
-  <w:style w:type="table" w:styleId="ColorfulGrid-Accent6">
+  <w:style w:type="table" w:styleId="ColourfulGridAccent6">
     <w:name w:val="Colorful Grid Accent 6"/>
     <w:basedOn w:val="TableNormal"/>
     <w:uiPriority w:val="73"/>
@@ -17092,6 +19257,42 @@
         <w:shd w:val="clear" w:color="auto" w:fill="FBCAA2" w:themeFill="accent6" w:themeFillTint="7F"/>
       </w:tcPr>
     </w:tblStylePr>
+  </w:style>
+  <w:style w:type="paragraph" w:styleId="TOC1">
+    <w:name w:val="toc 1"/>
+    <w:basedOn w:val="Normal"/>
+    <w:next w:val="Normal"/>
+    <w:autoRedefine/>
+    <w:uiPriority w:val="39"/>
+    <w:unhideWhenUsed/>
+    <w:rsid w:val="00FC04C3"/>
+    <w:pPr>
+      <w:spacing w:after="100"/>
+    </w:pPr>
+  </w:style>
+  <w:style w:type="paragraph" w:styleId="TOC3">
+    <w:name w:val="toc 3"/>
+    <w:basedOn w:val="Normal"/>
+    <w:next w:val="Normal"/>
+    <w:autoRedefine/>
+    <w:uiPriority w:val="39"/>
+    <w:unhideWhenUsed/>
+    <w:rsid w:val="00FC04C3"/>
+    <w:pPr>
+      <w:spacing w:after="100"/>
+      <w:ind w:left="420"/>
+    </w:pPr>
+  </w:style>
+  <w:style w:type="character" w:styleId="Hyperlink">
+    <w:name w:val="Hyperlink"/>
+    <w:basedOn w:val="DefaultParagraphFont"/>
+    <w:uiPriority w:val="99"/>
+    <w:unhideWhenUsed/>
+    <w:rsid w:val="00FC04C3"/>
+    <w:rPr>
+      <w:color w:val="0000FF" w:themeColor="hyperlink"/>
+      <w:u w:val="single"/>
+    </w:rPr>
   </w:style>
 </w:styles>
 </file>

</xml_diff>